<commit_message>
Finished answering question 1
</commit_message>
<xml_diff>
--- a/DM2026-Lab1-Master-Questions.docx
+++ b/DM2026-Lab1-Master-Questions.docx
@@ -1,6 +1,6 @@
 
 <file path=word/document.xml><?xml version="1.0" encoding="utf-8"?>
-<w:document xmlns:wpc="http://schemas.microsoft.com/office/word/2010/wordprocessingCanvas" xmlns:cx="http://schemas.microsoft.com/office/drawing/2014/chartex" xmlns:cx1="http://schemas.microsoft.com/office/drawing/2015/9/8/chartex" xmlns:cx2="http://schemas.microsoft.com/office/drawing/2015/10/21/chartex" xmlns:cx3="http://schemas.microsoft.com/office/drawing/2016/5/9/chartex" xmlns:cx4="http://schemas.microsoft.com/office/drawing/2016/5/10/chartex" xmlns:cx5="http://schemas.microsoft.com/office/drawing/2016/5/11/chartex" xmlns:cx6="http://schemas.microsoft.com/office/drawing/2016/5/12/chartex" xmlns:cx7="http://schemas.microsoft.com/office/drawing/2016/5/13/chartex" xmlns:cx8="http://schemas.microsoft.com/office/drawing/2016/5/14/chartex" xmlns:mc="http://schemas.openxmlformats.org/markup-compatibility/2006" xmlns:aink="http://schemas.microsoft.com/office/drawing/2016/ink" xmlns:am3d="http://schemas.microsoft.com/office/drawing/2017/model3d" xmlns:o="urn:schemas-microsoft-com:office:office" xmlns:oel="http://schemas.microsoft.com/office/2019/extlst" xmlns:r="http://schemas.openxmlformats.org/officeDocument/2006/relationships" xmlns:m="http://schemas.openxmlformats.org/officeDocument/2006/math" xmlns:v="urn:schemas-microsoft-com:vml" xmlns:wp14="http://schemas.microsoft.com/office/word/2010/wordprocessingDrawing" xmlns:wp="http://schemas.openxmlformats.org/drawingml/2006/wordprocessingDrawing" xmlns:w10="urn:schemas-microsoft-com:office:word" xmlns:w="http://schemas.openxmlformats.org/wordprocessingml/2006/main" xmlns:w14="http://schemas.microsoft.com/office/word/2010/wordml" xmlns:w15="http://schemas.microsoft.com/office/word/2012/wordml" xmlns:w16cex="http://schemas.microsoft.com/office/word/2018/wordml/cex" xmlns:w16cid="http://schemas.microsoft.com/office/word/2016/wordml/cid" xmlns:w16="http://schemas.microsoft.com/office/word/2018/wordml" xmlns:w16du="http://schemas.microsoft.com/office/word/2023/wordml/word16du" xmlns:w16sdtdh="http://schemas.microsoft.com/office/word/2020/wordml/sdtdatahash" xmlns:w16sdtfl="http://schemas.microsoft.com/office/word/2024/wordml/sdtformatlock" xmlns:w16se="http://schemas.microsoft.com/office/word/2015/wordml/symex" xmlns:wpg="http://schemas.microsoft.com/office/word/2010/wordprocessingGroup" xmlns:wpi="http://schemas.microsoft.com/office/word/2010/wordprocessingInk" xmlns:wne="http://schemas.microsoft.com/office/word/2006/wordml" xmlns:wps="http://schemas.microsoft.com/office/word/2010/wordprocessingShape" mc:Ignorable="w14 w15 w16se w16cid w16 w16cex w16sdtdh w16sdtfl w16du wp14">
+<w:document xmlns:wpc="http://schemas.microsoft.com/office/word/2010/wordprocessingCanvas" xmlns:mc="http://schemas.openxmlformats.org/markup-compatibility/2006" xmlns:o="urn:schemas-microsoft-com:office:office" xmlns:r="http://schemas.openxmlformats.org/officeDocument/2006/relationships" xmlns:m="http://schemas.openxmlformats.org/officeDocument/2006/math" xmlns:v="urn:schemas-microsoft-com:vml" xmlns:wp14="http://schemas.microsoft.com/office/word/2010/wordprocessingDrawing" xmlns:wp="http://schemas.openxmlformats.org/drawingml/2006/wordprocessingDrawing" xmlns:w10="urn:schemas-microsoft-com:office:word" xmlns:w="http://schemas.openxmlformats.org/wordprocessingml/2006/main" xmlns:w14="http://schemas.microsoft.com/office/word/2010/wordml" xmlns:w15="http://schemas.microsoft.com/office/word/2012/wordml" xmlns:wpg="http://schemas.microsoft.com/office/word/2010/wordprocessingGroup" xmlns:wpi="http://schemas.microsoft.com/office/word/2010/wordprocessingInk" xmlns:wne="http://schemas.microsoft.com/office/word/2006/wordml" xmlns:wps="http://schemas.microsoft.com/office/word/2010/wordprocessingShape" mc:Ignorable="w14 w15 wp14">
   <w:body>
     <w:p>
       <w:pPr>
@@ -195,6 +195,14 @@
         </w:rPr>
         <w:t>English Name:</w:t>
       </w:r>
+      <w:r>
+        <w:rPr>
+          <w:rFonts w:ascii="Century Schoolbook" w:hAnsi="Century Schoolbook"/>
+          <w:b/>
+          <w:bCs/>
+        </w:rPr>
+        <w:t xml:space="preserve"> Sifiso Njabuliso Mnisi</w:t>
+      </w:r>
     </w:p>
     <w:p>
       <w:pPr>
@@ -215,6 +223,22 @@
         </w:rPr>
         <w:t>Chinese Name:</w:t>
       </w:r>
+      <w:r>
+        <w:rPr>
+          <w:rFonts w:ascii="Century Schoolbook" w:hAnsi="Century Schoolbook"/>
+          <w:b/>
+          <w:bCs/>
+        </w:rPr>
+        <w:t xml:space="preserve"> </w:t>
+      </w:r>
+      <w:r>
+        <w:rPr>
+          <w:rFonts w:ascii="Century Schoolbook" w:hAnsi="Century Schoolbook" w:hint="eastAsia"/>
+          <w:b/>
+          <w:bCs/>
+        </w:rPr>
+        <w:t>訏常楽</w:t>
+      </w:r>
     </w:p>
     <w:p>
       <w:pPr>
@@ -235,6 +259,22 @@
         </w:rPr>
         <w:t>Email:</w:t>
       </w:r>
+      <w:r>
+        <w:rPr>
+          <w:rFonts w:ascii="Century Schoolbook" w:hAnsi="Century Schoolbook"/>
+          <w:b/>
+          <w:bCs/>
+        </w:rPr>
+        <w:t xml:space="preserve"> s</w:t>
+      </w:r>
+      <w:r>
+        <w:rPr>
+          <w:rFonts w:ascii="Century Schoolbook" w:hAnsi="Century Schoolbook"/>
+          <w:b/>
+          <w:bCs/>
+        </w:rPr>
+        <w:t>115368516@mail1.ncnu.edu.tw</w:t>
+      </w:r>
     </w:p>
     <w:p>
       <w:pPr>
@@ -255,6 +295,14 @@
         </w:rPr>
         <w:t>Student ID:</w:t>
       </w:r>
+      <w:r>
+        <w:rPr>
+          <w:rFonts w:ascii="Century Schoolbook" w:hAnsi="Century Schoolbook"/>
+          <w:b/>
+          <w:bCs/>
+        </w:rPr>
+        <w:t xml:space="preserve"> 115368516</w:t>
+      </w:r>
     </w:p>
     <w:p>
       <w:pPr>
@@ -275,6 +323,14 @@
         </w:rPr>
         <w:t>University:</w:t>
       </w:r>
+      <w:r>
+        <w:rPr>
+          <w:rFonts w:ascii="Century Schoolbook" w:hAnsi="Century Schoolbook"/>
+          <w:b/>
+          <w:bCs/>
+        </w:rPr>
+        <w:t xml:space="preserve"> National Chi Nan University</w:t>
+      </w:r>
     </w:p>
     <w:p>
       <w:pPr>
@@ -449,35 +505,7 @@
         <w:rPr>
           <w:rFonts w:ascii="Century Schoolbook" w:hAnsi="Century Schoolbook"/>
         </w:rPr>
-        <w:t xml:space="preserve">Read the task; change parameters when asked (e.g. </w:t>
-      </w:r>
-      <w:proofErr w:type="spellStart"/>
-      <w:r>
-        <w:rPr>
-          <w:rFonts w:ascii="Century Schoolbook" w:hAnsi="Century Schoolbook"/>
-        </w:rPr>
-        <w:t>stop_words</w:t>
-      </w:r>
-      <w:proofErr w:type="spellEnd"/>
-      <w:r>
-        <w:rPr>
-          <w:rFonts w:ascii="Century Schoolbook" w:hAnsi="Century Schoolbook"/>
-        </w:rPr>
-        <w:t xml:space="preserve">, thresholds, k, </w:t>
-      </w:r>
-      <w:proofErr w:type="spellStart"/>
-      <w:r>
-        <w:rPr>
-          <w:rFonts w:ascii="Century Schoolbook" w:hAnsi="Century Schoolbook"/>
-        </w:rPr>
-        <w:t>minSup</w:t>
-      </w:r>
-      <w:proofErr w:type="spellEnd"/>
-      <w:r>
-        <w:rPr>
-          <w:rFonts w:ascii="Century Schoolbook" w:hAnsi="Century Schoolbook"/>
-        </w:rPr>
-        <w:t>).</w:t>
+        <w:t>Read the task; change parameters when asked (e.g. stop_words, thresholds, k, minSup).</w:t>
       </w:r>
     </w:p>
     <w:p>
@@ -1087,21 +1115,7 @@
         <w:rPr>
           <w:rFonts w:ascii="Century Schoolbook" w:hAnsi="Century Schoolbook"/>
         </w:rPr>
-        <w:t xml:space="preserve"> or leave it blank only if you truly did not use AI for that question. References are still encouraged if you </w:t>
-      </w:r>
-      <w:proofErr w:type="gramStart"/>
-      <w:r>
-        <w:rPr>
-          <w:rFonts w:ascii="Century Schoolbook" w:hAnsi="Century Schoolbook"/>
-        </w:rPr>
-        <w:t>looked</w:t>
-      </w:r>
-      <w:proofErr w:type="gramEnd"/>
-      <w:r>
-        <w:rPr>
-          <w:rFonts w:ascii="Century Schoolbook" w:hAnsi="Century Schoolbook"/>
-        </w:rPr>
-        <w:t xml:space="preserve"> anything up.</w:t>
+        <w:t xml:space="preserve"> or leave it blank only if you truly did not use AI for that question. References are still encouraged if you looked anything up.</w:t>
       </w:r>
     </w:p>
     <w:p>
@@ -1380,21 +1394,7 @@
         <w:rPr>
           <w:rFonts w:ascii="Century Schoolbook" w:hAnsi="Century Schoolbook"/>
         </w:rPr>
-        <w:t xml:space="preserve"> Filter the </w:t>
-      </w:r>
-      <w:proofErr w:type="spellStart"/>
-      <w:r>
-        <w:rPr>
-          <w:rFonts w:ascii="Century Schoolbook" w:hAnsi="Century Schoolbook"/>
-        </w:rPr>
-        <w:t>dataframe</w:t>
-      </w:r>
-      <w:proofErr w:type="spellEnd"/>
-      <w:r>
-        <w:rPr>
-          <w:rFonts w:ascii="Century Schoolbook" w:hAnsi="Century Schoolbook"/>
-        </w:rPr>
-        <w:t xml:space="preserve"> </w:t>
+        <w:t xml:space="preserve"> Filter the dataframe </w:t>
       </w:r>
       <w:r>
         <w:rPr>
@@ -1410,7 +1410,6 @@
         </w:rPr>
         <w:t xml:space="preserve"> for the category </w:t>
       </w:r>
-      <w:proofErr w:type="spellStart"/>
       <w:r>
         <w:rPr>
           <w:rFonts w:ascii="Century Schoolbook" w:hAnsi="Century Schoolbook"/>
@@ -1419,7 +1418,6 @@
         </w:rPr>
         <w:t>sci.med</w:t>
       </w:r>
-      <w:proofErr w:type="spellEnd"/>
       <w:r>
         <w:rPr>
           <w:rFonts w:ascii="Century Schoolbook" w:hAnsi="Century Schoolbook"/>
@@ -1492,6 +1490,8 @@
         <w:jc w:val="both"/>
         <w:rPr>
           <w:rFonts w:ascii="Century Schoolbook" w:hAnsi="Century Schoolbook"/>
+          <w:b/>
+          <w:bCs/>
         </w:rPr>
       </w:pPr>
       <w:r>
@@ -1505,6 +1505,134 @@
     </w:p>
     <w:p>
       <w:pPr>
+        <w:pStyle w:val="ListParagraph"/>
+        <w:numPr>
+          <w:ilvl w:val="0"/>
+          <w:numId w:val="25"/>
+        </w:numPr>
+        <w:jc w:val="both"/>
+        <w:rPr>
+          <w:rFonts w:ascii="Century Schoolbook" w:hAnsi="Century Schoolbook"/>
+        </w:rPr>
+      </w:pPr>
+      <w:r>
+        <w:rPr>
+          <w:rFonts w:ascii="Century Schoolbook" w:hAnsi="Century Schoolbook"/>
+        </w:rPr>
+        <w:t>594</w:t>
+      </w:r>
+    </w:p>
+    <w:p>
+      <w:pPr>
+        <w:pStyle w:val="ListParagraph"/>
+        <w:numPr>
+          <w:ilvl w:val="0"/>
+          <w:numId w:val="25"/>
+        </w:numPr>
+        <w:jc w:val="both"/>
+        <w:rPr>
+          <w:rFonts w:ascii="Century Schoolbook" w:hAnsi="Century Schoolbook"/>
+        </w:rPr>
+      </w:pPr>
+      <w:r>
+        <w:rPr>
+          <w:rFonts w:ascii="Century Schoolbook" w:hAnsi="Century Schoolbook"/>
+        </w:rPr>
+        <w:t>It is crucial b</w:t>
+      </w:r>
+      <w:r>
+        <w:rPr>
+          <w:rFonts w:ascii="Century Schoolbook" w:hAnsi="Century Schoolbook"/>
+        </w:rPr>
+        <w:t>ecause it ensures data relevance, reduces computational complexity, a</w:t>
+      </w:r>
+      <w:r>
+        <w:rPr>
+          <w:rFonts w:ascii="Century Schoolbook" w:hAnsi="Century Schoolbook"/>
+        </w:rPr>
+        <w:t xml:space="preserve">nd prevents the masking effect; </w:t>
+      </w:r>
+      <w:r>
+        <w:rPr>
+          <w:rFonts w:ascii="Century Schoolbook" w:hAnsi="Century Schoolbook"/>
+        </w:rPr>
+        <w:t>where dominant patterns in large categories drown out meani</w:t>
+      </w:r>
+      <w:r>
+        <w:rPr>
+          <w:rFonts w:ascii="Century Schoolbook" w:hAnsi="Century Schoolbook"/>
+        </w:rPr>
+        <w:t>ngful signals in niche segments</w:t>
+      </w:r>
+      <w:r>
+        <w:rPr>
+          <w:rFonts w:ascii="Century Schoolbook" w:hAnsi="Century Schoolbook"/>
+        </w:rPr>
+        <w:t>.</w:t>
+      </w:r>
+      <w:r>
+        <w:rPr>
+          <w:rFonts w:ascii="Century Schoolbook" w:hAnsi="Century Schoolbook"/>
+        </w:rPr>
+        <w:t xml:space="preserve"> Also, i</w:t>
+      </w:r>
+      <w:r>
+        <w:rPr>
+          <w:rFonts w:ascii="Century Schoolbook" w:hAnsi="Century Schoolbook"/>
+        </w:rPr>
+        <w:t xml:space="preserve">t reduces noise by excluding documents that may contain unrelated information. </w:t>
+      </w:r>
+      <w:r>
+        <w:rPr>
+          <w:rFonts w:ascii="Century Schoolbook" w:hAnsi="Century Schoolbook"/>
+        </w:rPr>
+        <w:t>To add more</w:t>
+      </w:r>
+      <w:r>
+        <w:rPr>
+          <w:rFonts w:ascii="Century Schoolbook" w:hAnsi="Century Schoolbook"/>
+        </w:rPr>
+        <w:t xml:space="preserve">, it helps frequent pattern mining identify words and combinations of words that are more relevant to the selected topic. </w:t>
+      </w:r>
+      <w:r>
+        <w:rPr>
+          <w:rFonts w:ascii="Century Schoolbook" w:hAnsi="Century Schoolbook"/>
+        </w:rPr>
+        <w:t>Moreover</w:t>
+      </w:r>
+      <w:r>
+        <w:rPr>
+          <w:rFonts w:ascii="Century Schoolbook" w:hAnsi="Century Schoolbook"/>
+        </w:rPr>
+        <w:t>, it makes the results easier to interpret because the discovered patterns can be understood within a specific subject area. Finally, isolating categories allows researchers to compare patterns across different groups and identify what makes each category distinctive.</w:t>
+      </w:r>
+      <w:r>
+        <w:rPr>
+          <w:rFonts w:ascii="Century Schoolbook" w:hAnsi="Century Schoolbook"/>
+        </w:rPr>
+        <w:t xml:space="preserve"> </w:t>
+      </w:r>
+      <w:r>
+        <w:rPr>
+          <w:rFonts w:ascii="Century Schoolbook" w:hAnsi="Century Schoolbook"/>
+        </w:rPr>
+        <w:t>For example,</w:t>
+      </w:r>
+      <w:r>
+        <w:rPr>
+          <w:rFonts w:ascii="Century Schoolbook" w:hAnsi="Century Schoolbook"/>
+        </w:rPr>
+        <w:t xml:space="preserve"> in tis case,</w:t>
+      </w:r>
+      <w:r>
+        <w:rPr>
+          <w:rFonts w:ascii="Century Schoolbook" w:hAnsi="Century Schoolbook"/>
+        </w:rPr>
+        <w:t xml:space="preserve"> selecting the sci.med category means that the analysis focuses on medical science discussions rather than mixing them with unrelated topics such as computer graphics or religion.</w:t>
+      </w:r>
+    </w:p>
+    <w:p>
+      <w:pPr>
         <w:jc w:val="both"/>
         <w:rPr>
           <w:rFonts w:ascii="Century Schoolbook" w:hAnsi="Century Schoolbook"/>
@@ -1522,8 +1650,16 @@
         <w:rPr>
           <w:rFonts w:ascii="Century Schoolbook" w:hAnsi="Century Schoolbook"/>
         </w:rPr>
-        <w:t xml:space="preserve"> Yes / No </w:t>
-      </w:r>
+        <w:t xml:space="preserve"> Yes</w:t>
+      </w:r>
+      <w:r>
+        <w:rPr>
+          <w:rFonts w:ascii="Century Schoolbook" w:hAnsi="Century Schoolbook"/>
+        </w:rPr>
+        <w:t xml:space="preserve"> </w:t>
+      </w:r>
+      <w:bookmarkStart w:id="0" w:name="_GoBack"/>
+      <w:bookmarkEnd w:id="0"/>
     </w:p>
     <w:p>
       <w:pPr>
@@ -1545,6 +1681,12 @@
           <w:rFonts w:ascii="Century Schoolbook" w:hAnsi="Century Schoolbook"/>
         </w:rPr>
         <w:t xml:space="preserve"> </w:t>
+      </w:r>
+      <w:r>
+        <w:rPr>
+          <w:rFonts w:ascii="Century Schoolbook" w:hAnsi="Century Schoolbook"/>
+        </w:rPr>
+        <w:t>For more explanations on FPM, to make sure that I understand them well.</w:t>
       </w:r>
     </w:p>
     <w:p>
@@ -1624,21 +1766,115 @@
         </w:rPr>
         <w:t xml:space="preserve"> Section 4.1 — Question 2 (take home) (after the </w:t>
       </w:r>
-      <w:proofErr w:type="gramStart"/>
-      <w:r>
-        <w:rPr>
-          <w:rFonts w:ascii="Century Schoolbook" w:hAnsi="Century Schoolbook"/>
-          <w:b/>
-          <w:bCs/>
-        </w:rPr>
-        <w:t>dropna(</w:t>
-      </w:r>
-      <w:proofErr w:type="gramEnd"/>
-      <w:r>
-        <w:rPr>
-          <w:rFonts w:ascii="Century Schoolbook" w:hAnsi="Century Schoolbook"/>
-          <w:b/>
-          <w:bCs/>
+      <w:r>
+        <w:rPr>
+          <w:rFonts w:ascii="Century Schoolbook" w:hAnsi="Century Schoolbook"/>
+          <w:b/>
+          <w:bCs/>
+        </w:rPr>
+        <w:t>dropna()</w:t>
+      </w:r>
+      <w:r>
+        <w:rPr>
+          <w:rFonts w:ascii="Century Schoolbook" w:hAnsi="Century Schoolbook"/>
+        </w:rPr>
+        <w:t xml:space="preserve"> demonstration)</w:t>
+      </w:r>
+    </w:p>
+    <w:p>
+      <w:pPr>
+        <w:jc w:val="both"/>
+        <w:rPr>
+          <w:rFonts w:ascii="Century Schoolbook" w:hAnsi="Century Schoolbook"/>
+        </w:rPr>
+      </w:pPr>
+      <w:r>
+        <w:rPr>
+          <w:rFonts w:ascii="Century Schoolbook" w:hAnsi="Century Schoolbook"/>
+          <w:b/>
+          <w:bCs/>
+        </w:rPr>
+        <w:t>Task:</w:t>
+      </w:r>
+      <w:r>
+        <w:rPr>
+          <w:rFonts w:ascii="Century Schoolbook" w:hAnsi="Century Schoolbook"/>
+        </w:rPr>
+        <w:t xml:space="preserve"> </w:t>
+      </w:r>
+      <w:r>
+        <w:rPr>
+          <w:rFonts w:ascii="Century Schoolbook" w:hAnsi="Century Schoolbook"/>
+        </w:rPr>
+        <w:t xml:space="preserve">In Section 4.1, a dummy record with a missing value is injected and then removed using the </w:t>
+      </w:r>
+      <w:r>
+        <w:rPr>
+          <w:rFonts w:ascii="Century Schoolbook" w:hAnsi="Century Schoolbook"/>
+          <w:b/>
+          <w:bCs/>
+        </w:rPr>
+        <w:t>dropna()</w:t>
+      </w:r>
+      <w:r>
+        <w:rPr>
+          <w:rFonts w:ascii="Century Schoolbook" w:hAnsi="Century Schoolbook"/>
+        </w:rPr>
+        <w:t xml:space="preserve"> function.</w:t>
+      </w:r>
+    </w:p>
+    <w:p>
+      <w:pPr>
+        <w:jc w:val="both"/>
+        <w:rPr>
+          <w:rFonts w:ascii="Century Schoolbook" w:hAnsi="Century Schoolbook"/>
+        </w:rPr>
+      </w:pPr>
+      <w:r>
+        <w:rPr>
+          <w:rFonts w:ascii="Century Schoolbook" w:hAnsi="Century Schoolbook"/>
+          <w:b/>
+          <w:bCs/>
+        </w:rPr>
+        <w:t>Question:</w:t>
+      </w:r>
+      <w:r>
+        <w:rPr>
+          <w:rFonts w:ascii="Century Schoolbook" w:hAnsi="Century Schoolbook"/>
+        </w:rPr>
+        <w:t xml:space="preserve"> If 40% of documents were missing the </w:t>
+      </w:r>
+      <w:r>
+        <w:rPr>
+          <w:rFonts w:ascii="Century Schoolbook" w:hAnsi="Century Schoolbook"/>
+          <w:b/>
+          <w:bCs/>
+        </w:rPr>
+        <w:t>category_name</w:t>
+      </w:r>
+      <w:r>
+        <w:rPr>
+          <w:rFonts w:ascii="Century Schoolbook" w:hAnsi="Century Schoolbook"/>
+        </w:rPr>
+        <w:t xml:space="preserve"> label, why would simply dropping these rows (</w:t>
+      </w:r>
+      <w:r>
+        <w:rPr>
+          <w:rFonts w:ascii="Century Schoolbook" w:hAnsi="Century Schoolbook"/>
+        </w:rPr>
+        <w:t xml:space="preserve">with </w:t>
+      </w:r>
+      <w:r>
+        <w:rPr>
+          <w:rFonts w:ascii="Century Schoolbook" w:hAnsi="Century Schoolbook"/>
+          <w:b/>
+          <w:bCs/>
+        </w:rPr>
+        <w:t>dropna()</w:t>
+      </w:r>
+      <w:r>
+        <w:rPr>
+          <w:rFonts w:ascii="Century Schoolbook" w:hAnsi="Century Schoolbook"/>
         </w:rPr>
         <w:t>)</w:t>
       </w:r>
@@ -1646,23 +1882,61 @@
         <w:rPr>
           <w:rFonts w:ascii="Century Schoolbook" w:hAnsi="Century Schoolbook"/>
         </w:rPr>
-        <w:t xml:space="preserve"> demonstration)</w:t>
-      </w:r>
-    </w:p>
-    <w:p>
-      <w:pPr>
-        <w:jc w:val="both"/>
-        <w:rPr>
-          <w:rFonts w:ascii="Century Schoolbook" w:hAnsi="Century Schoolbook"/>
-        </w:rPr>
-      </w:pPr>
-      <w:r>
-        <w:rPr>
-          <w:rFonts w:ascii="Century Schoolbook" w:hAnsi="Century Schoolbook"/>
-          <w:b/>
-          <w:bCs/>
-        </w:rPr>
-        <w:t>Task:</w:t>
+        <w:t xml:space="preserve"> be a flawed data mining strategy? Name one objective alternative so the text data can still be utilized.</w:t>
+      </w:r>
+    </w:p>
+    <w:p>
+      <w:pPr>
+        <w:jc w:val="both"/>
+        <w:rPr>
+          <w:rFonts w:ascii="Century Schoolbook" w:hAnsi="Century Schoolbook"/>
+        </w:rPr>
+      </w:pPr>
+      <w:r>
+        <w:rPr>
+          <w:rFonts w:ascii="Century Schoolbook" w:hAnsi="Century Schoolbook"/>
+          <w:b/>
+          <w:bCs/>
+        </w:rPr>
+        <w:t>Answer:</w:t>
+      </w:r>
+    </w:p>
+    <w:p>
+      <w:pPr>
+        <w:jc w:val="both"/>
+        <w:rPr>
+          <w:rFonts w:ascii="Century Schoolbook" w:hAnsi="Century Schoolbook"/>
+        </w:rPr>
+      </w:pPr>
+      <w:r>
+        <w:rPr>
+          <w:rFonts w:ascii="Century Schoolbook" w:hAnsi="Century Schoolbook"/>
+          <w:b/>
+          <w:bCs/>
+        </w:rPr>
+        <w:t>AI used for this answer:</w:t>
+      </w:r>
+      <w:r>
+        <w:rPr>
+          <w:rFonts w:ascii="Century Schoolbook" w:hAnsi="Century Schoolbook"/>
+        </w:rPr>
+        <w:t xml:space="preserve"> Yes / No </w:t>
+      </w:r>
+    </w:p>
+    <w:p>
+      <w:pPr>
+        <w:jc w:val="both"/>
+        <w:rPr>
+          <w:rFonts w:ascii="Century Schoolbook" w:hAnsi="Century Schoolbook"/>
+        </w:rPr>
+      </w:pPr>
+      <w:r>
+        <w:rPr>
+          <w:rFonts w:ascii="Century Schoolbook" w:hAnsi="Century Schoolbook"/>
+          <w:b/>
+          <w:bCs/>
+        </w:rPr>
+        <w:t>If yes, how:</w:t>
       </w:r>
       <w:r>
         <w:rPr>
@@ -1670,183 +1944,21 @@
         </w:rPr>
         <w:t xml:space="preserve"> </w:t>
       </w:r>
-      <w:r>
-        <w:rPr>
-          <w:rFonts w:ascii="Century Schoolbook" w:hAnsi="Century Schoolbook"/>
-        </w:rPr>
-        <w:t xml:space="preserve">In Section 4.1, a dummy record with a missing value is injected and then removed using the </w:t>
-      </w:r>
-      <w:proofErr w:type="spellStart"/>
-      <w:proofErr w:type="gramStart"/>
-      <w:r>
-        <w:rPr>
-          <w:rFonts w:ascii="Century Schoolbook" w:hAnsi="Century Schoolbook"/>
-          <w:b/>
-          <w:bCs/>
-        </w:rPr>
-        <w:t>dropna</w:t>
-      </w:r>
-      <w:proofErr w:type="spellEnd"/>
-      <w:r>
-        <w:rPr>
-          <w:rFonts w:ascii="Century Schoolbook" w:hAnsi="Century Schoolbook"/>
-          <w:b/>
-          <w:bCs/>
-        </w:rPr>
-        <w:t>(</w:t>
-      </w:r>
-      <w:proofErr w:type="gramEnd"/>
-      <w:r>
-        <w:rPr>
-          <w:rFonts w:ascii="Century Schoolbook" w:hAnsi="Century Schoolbook"/>
-          <w:b/>
-          <w:bCs/>
-        </w:rPr>
-        <w:t>)</w:t>
-      </w:r>
-      <w:r>
-        <w:rPr>
-          <w:rFonts w:ascii="Century Schoolbook" w:hAnsi="Century Schoolbook"/>
-        </w:rPr>
-        <w:t xml:space="preserve"> function.</w:t>
-      </w:r>
-    </w:p>
-    <w:p>
-      <w:pPr>
-        <w:jc w:val="both"/>
-        <w:rPr>
-          <w:rFonts w:ascii="Century Schoolbook" w:hAnsi="Century Schoolbook"/>
-        </w:rPr>
-      </w:pPr>
-      <w:r>
-        <w:rPr>
-          <w:rFonts w:ascii="Century Schoolbook" w:hAnsi="Century Schoolbook"/>
-          <w:b/>
-          <w:bCs/>
-        </w:rPr>
-        <w:t>Question:</w:t>
-      </w:r>
-      <w:r>
-        <w:rPr>
-          <w:rFonts w:ascii="Century Schoolbook" w:hAnsi="Century Schoolbook"/>
-        </w:rPr>
-        <w:t xml:space="preserve"> If 40% of documents were missing the </w:t>
-      </w:r>
-      <w:proofErr w:type="spellStart"/>
-      <w:r>
-        <w:rPr>
-          <w:rFonts w:ascii="Century Schoolbook" w:hAnsi="Century Schoolbook"/>
-          <w:b/>
-          <w:bCs/>
-        </w:rPr>
-        <w:t>category_name</w:t>
-      </w:r>
-      <w:proofErr w:type="spellEnd"/>
-      <w:r>
-        <w:rPr>
-          <w:rFonts w:ascii="Century Schoolbook" w:hAnsi="Century Schoolbook"/>
-        </w:rPr>
-        <w:t xml:space="preserve"> label, why would simply dropping these rows (</w:t>
-      </w:r>
-      <w:r>
-        <w:rPr>
-          <w:rFonts w:ascii="Century Schoolbook" w:hAnsi="Century Schoolbook"/>
-        </w:rPr>
-        <w:t xml:space="preserve">with </w:t>
-      </w:r>
-      <w:proofErr w:type="spellStart"/>
-      <w:proofErr w:type="gramStart"/>
-      <w:r>
-        <w:rPr>
-          <w:rFonts w:ascii="Century Schoolbook" w:hAnsi="Century Schoolbook"/>
-          <w:b/>
-          <w:bCs/>
-        </w:rPr>
-        <w:t>dropna</w:t>
-      </w:r>
-      <w:proofErr w:type="spellEnd"/>
-      <w:r>
-        <w:rPr>
-          <w:rFonts w:ascii="Century Schoolbook" w:hAnsi="Century Schoolbook"/>
-          <w:b/>
-          <w:bCs/>
-        </w:rPr>
-        <w:t>(</w:t>
-      </w:r>
-      <w:proofErr w:type="gramEnd"/>
-      <w:r>
-        <w:rPr>
-          <w:rFonts w:ascii="Century Schoolbook" w:hAnsi="Century Schoolbook"/>
-          <w:b/>
-          <w:bCs/>
-        </w:rPr>
-        <w:t>)</w:t>
-      </w:r>
-      <w:r>
-        <w:rPr>
-          <w:rFonts w:ascii="Century Schoolbook" w:hAnsi="Century Schoolbook"/>
-        </w:rPr>
-        <w:t>)</w:t>
-      </w:r>
-      <w:r>
-        <w:rPr>
-          <w:rFonts w:ascii="Century Schoolbook" w:hAnsi="Century Schoolbook"/>
-        </w:rPr>
-        <w:t xml:space="preserve"> be a flawed data mining strategy? Name one objective alternative so the text data can still be utilized.</w:t>
-      </w:r>
-    </w:p>
-    <w:p>
-      <w:pPr>
-        <w:jc w:val="both"/>
-        <w:rPr>
-          <w:rFonts w:ascii="Century Schoolbook" w:hAnsi="Century Schoolbook"/>
-        </w:rPr>
-      </w:pPr>
-      <w:r>
-        <w:rPr>
-          <w:rFonts w:ascii="Century Schoolbook" w:hAnsi="Century Schoolbook"/>
-          <w:b/>
-          <w:bCs/>
-        </w:rPr>
-        <w:t>Answer:</w:t>
-      </w:r>
-    </w:p>
-    <w:p>
-      <w:pPr>
-        <w:jc w:val="both"/>
-        <w:rPr>
-          <w:rFonts w:ascii="Century Schoolbook" w:hAnsi="Century Schoolbook"/>
-        </w:rPr>
-      </w:pPr>
-      <w:r>
-        <w:rPr>
-          <w:rFonts w:ascii="Century Schoolbook" w:hAnsi="Century Schoolbook"/>
-          <w:b/>
-          <w:bCs/>
-        </w:rPr>
-        <w:t>AI used for this answer:</w:t>
-      </w:r>
-      <w:r>
-        <w:rPr>
-          <w:rFonts w:ascii="Century Schoolbook" w:hAnsi="Century Schoolbook"/>
-        </w:rPr>
-        <w:t xml:space="preserve"> Yes / No </w:t>
-      </w:r>
-    </w:p>
-    <w:p>
-      <w:pPr>
-        <w:jc w:val="both"/>
-        <w:rPr>
-          <w:rFonts w:ascii="Century Schoolbook" w:hAnsi="Century Schoolbook"/>
-        </w:rPr>
-      </w:pPr>
-      <w:r>
-        <w:rPr>
-          <w:rFonts w:ascii="Century Schoolbook" w:hAnsi="Century Schoolbook"/>
-          <w:b/>
-          <w:bCs/>
-        </w:rPr>
-        <w:t>If yes, how:</w:t>
+    </w:p>
+    <w:p>
+      <w:pPr>
+        <w:jc w:val="both"/>
+        <w:rPr>
+          <w:rFonts w:ascii="Century Schoolbook" w:hAnsi="Century Schoolbook"/>
+        </w:rPr>
+      </w:pPr>
+      <w:r>
+        <w:rPr>
+          <w:rFonts w:ascii="Century Schoolbook" w:hAnsi="Century Schoolbook"/>
+          <w:b/>
+          <w:bCs/>
+        </w:rPr>
+        <w:t>External references (links):</w:t>
       </w:r>
       <w:r>
         <w:rPr>
@@ -1862,97 +1974,74 @@
           <w:rFonts w:ascii="Century Schoolbook" w:hAnsi="Century Schoolbook"/>
         </w:rPr>
       </w:pPr>
-      <w:r>
-        <w:rPr>
-          <w:rFonts w:ascii="Century Schoolbook" w:hAnsi="Century Schoolbook"/>
-          <w:b/>
-          <w:bCs/>
-        </w:rPr>
-        <w:t>External references (links):</w:t>
-      </w:r>
-      <w:r>
-        <w:rPr>
-          <w:rFonts w:ascii="Century Schoolbook" w:hAnsi="Century Schoolbook"/>
-        </w:rPr>
-        <w:t xml:space="preserve"> </w:t>
-      </w:r>
-    </w:p>
-    <w:p>
-      <w:pPr>
-        <w:jc w:val="both"/>
-        <w:rPr>
-          <w:rFonts w:ascii="Century Schoolbook" w:hAnsi="Century Schoolbook"/>
-        </w:rPr>
-      </w:pPr>
-    </w:p>
-    <w:p>
-      <w:pPr>
-        <w:jc w:val="both"/>
-        <w:rPr>
-          <w:rFonts w:ascii="Century Schoolbook" w:hAnsi="Century Schoolbook"/>
-        </w:rPr>
-      </w:pPr>
-    </w:p>
-    <w:p>
-      <w:pPr>
-        <w:jc w:val="both"/>
-        <w:rPr>
-          <w:rFonts w:ascii="Century Schoolbook" w:hAnsi="Century Schoolbook"/>
-        </w:rPr>
-      </w:pPr>
-    </w:p>
-    <w:p>
-      <w:pPr>
-        <w:jc w:val="both"/>
-        <w:rPr>
-          <w:rFonts w:ascii="Century Schoolbook" w:hAnsi="Century Schoolbook"/>
-        </w:rPr>
-      </w:pPr>
-    </w:p>
-    <w:p>
-      <w:pPr>
-        <w:jc w:val="both"/>
-        <w:rPr>
-          <w:rFonts w:ascii="Century Schoolbook" w:hAnsi="Century Schoolbook"/>
-        </w:rPr>
-      </w:pPr>
-    </w:p>
-    <w:p>
-      <w:pPr>
-        <w:jc w:val="both"/>
-        <w:rPr>
-          <w:rFonts w:ascii="Century Schoolbook" w:hAnsi="Century Schoolbook"/>
-        </w:rPr>
-      </w:pPr>
-    </w:p>
-    <w:p>
-      <w:pPr>
-        <w:jc w:val="both"/>
-        <w:rPr>
-          <w:rFonts w:ascii="Century Schoolbook" w:hAnsi="Century Schoolbook"/>
-        </w:rPr>
-      </w:pPr>
-    </w:p>
-    <w:p>
-      <w:pPr>
-        <w:jc w:val="both"/>
-        <w:rPr>
-          <w:rFonts w:ascii="Century Schoolbook" w:hAnsi="Century Schoolbook"/>
-        </w:rPr>
-      </w:pPr>
-    </w:p>
-    <w:p>
-      <w:pPr>
-        <w:jc w:val="both"/>
-        <w:rPr>
-          <w:rFonts w:ascii="Century Schoolbook" w:hAnsi="Century Schoolbook"/>
-        </w:rPr>
-      </w:pPr>
-      <w:r>
-        <w:rPr>
-          <w:rFonts w:ascii="Century Schoolbook" w:hAnsi="Century Schoolbook"/>
-        </w:rPr>
-        <w:lastRenderedPageBreak/>
+    </w:p>
+    <w:p>
+      <w:pPr>
+        <w:jc w:val="both"/>
+        <w:rPr>
+          <w:rFonts w:ascii="Century Schoolbook" w:hAnsi="Century Schoolbook"/>
+        </w:rPr>
+      </w:pPr>
+    </w:p>
+    <w:p>
+      <w:pPr>
+        <w:jc w:val="both"/>
+        <w:rPr>
+          <w:rFonts w:ascii="Century Schoolbook" w:hAnsi="Century Schoolbook"/>
+        </w:rPr>
+      </w:pPr>
+    </w:p>
+    <w:p>
+      <w:pPr>
+        <w:jc w:val="both"/>
+        <w:rPr>
+          <w:rFonts w:ascii="Century Schoolbook" w:hAnsi="Century Schoolbook"/>
+        </w:rPr>
+      </w:pPr>
+    </w:p>
+    <w:p>
+      <w:pPr>
+        <w:jc w:val="both"/>
+        <w:rPr>
+          <w:rFonts w:ascii="Century Schoolbook" w:hAnsi="Century Schoolbook"/>
+        </w:rPr>
+      </w:pPr>
+    </w:p>
+    <w:p>
+      <w:pPr>
+        <w:jc w:val="both"/>
+        <w:rPr>
+          <w:rFonts w:ascii="Century Schoolbook" w:hAnsi="Century Schoolbook"/>
+        </w:rPr>
+      </w:pPr>
+    </w:p>
+    <w:p>
+      <w:pPr>
+        <w:jc w:val="both"/>
+        <w:rPr>
+          <w:rFonts w:ascii="Century Schoolbook" w:hAnsi="Century Schoolbook"/>
+        </w:rPr>
+      </w:pPr>
+    </w:p>
+    <w:p>
+      <w:pPr>
+        <w:jc w:val="both"/>
+        <w:rPr>
+          <w:rFonts w:ascii="Century Schoolbook" w:hAnsi="Century Schoolbook"/>
+        </w:rPr>
+      </w:pPr>
+    </w:p>
+    <w:p>
+      <w:pPr>
+        <w:jc w:val="both"/>
+        <w:rPr>
+          <w:rFonts w:ascii="Century Schoolbook" w:hAnsi="Century Schoolbook"/>
+        </w:rPr>
+      </w:pPr>
+      <w:r>
+        <w:rPr>
+          <w:rFonts w:ascii="Century Schoolbook" w:hAnsi="Century Schoolbook"/>
+        </w:rPr>
         <w:pict w14:anchorId="4353243F">
           <v:rect id="_x0000_i1029" style="width:0;height:1.5pt" o:hralign="center" o:hrstd="t" o:hr="t" fillcolor="#a0a0a0" stroked="f"/>
         </w:pict>
@@ -2025,41 +2114,13 @@
         </w:rPr>
         <w:t xml:space="preserve">In Section 5.1, the code uses </w:t>
       </w:r>
-      <w:proofErr w:type="spellStart"/>
-      <w:r>
-        <w:rPr>
-          <w:rFonts w:ascii="Century Schoolbook" w:hAnsi="Century Schoolbook"/>
-          <w:b/>
-          <w:bCs/>
-        </w:rPr>
-        <w:t>X_sample</w:t>
-      </w:r>
-      <w:proofErr w:type="spellEnd"/>
-      <w:r>
-        <w:rPr>
-          <w:rFonts w:ascii="Century Schoolbook" w:hAnsi="Century Schoolbook"/>
-          <w:b/>
-          <w:bCs/>
-        </w:rPr>
-        <w:t xml:space="preserve"> = </w:t>
-      </w:r>
-      <w:proofErr w:type="spellStart"/>
-      <w:r>
-        <w:rPr>
-          <w:rFonts w:ascii="Century Schoolbook" w:hAnsi="Century Schoolbook"/>
-          <w:b/>
-          <w:bCs/>
-        </w:rPr>
-        <w:t>X.sample</w:t>
-      </w:r>
-      <w:proofErr w:type="spellEnd"/>
-      <w:r>
-        <w:rPr>
-          <w:rFonts w:ascii="Century Schoolbook" w:hAnsi="Century Schoolbook"/>
-          <w:b/>
-          <w:bCs/>
-        </w:rPr>
-        <w:t>(n=1000)</w:t>
+      <w:r>
+        <w:rPr>
+          <w:rFonts w:ascii="Century Schoolbook" w:hAnsi="Century Schoolbook"/>
+          <w:b/>
+          <w:bCs/>
+        </w:rPr>
+        <w:t>X_sample = X.sample(n=1000)</w:t>
       </w:r>
       <w:r>
         <w:rPr>
@@ -2287,7 +2348,6 @@
         </w:rPr>
         <w:t xml:space="preserve">In Section 5.3, the </w:t>
       </w:r>
-      <w:proofErr w:type="spellStart"/>
       <w:r>
         <w:rPr>
           <w:rFonts w:ascii="Century Schoolbook" w:hAnsi="Century Schoolbook"/>
@@ -2296,48 +2356,19 @@
         </w:rPr>
         <w:t>CountVectorizer</w:t>
       </w:r>
-      <w:proofErr w:type="spellEnd"/>
       <w:r>
         <w:rPr>
           <w:rFonts w:ascii="Century Schoolbook" w:hAnsi="Century Schoolbook"/>
         </w:rPr>
         <w:t xml:space="preserve"> converts text into a document-term matrix using </w:t>
       </w:r>
-      <w:proofErr w:type="spellStart"/>
-      <w:r>
-        <w:rPr>
-          <w:rFonts w:ascii="Century Schoolbook" w:hAnsi="Century Schoolbook"/>
-          <w:b/>
-          <w:bCs/>
-        </w:rPr>
-        <w:t>stop_words</w:t>
-      </w:r>
-      <w:proofErr w:type="spellEnd"/>
-      <w:r>
-        <w:rPr>
-          <w:rFonts w:ascii="Century Schoolbook" w:hAnsi="Century Schoolbook"/>
-          <w:b/>
-          <w:bCs/>
-        </w:rPr>
-        <w:t>='</w:t>
-      </w:r>
-      <w:proofErr w:type="spellStart"/>
-      <w:r>
-        <w:rPr>
-          <w:rFonts w:ascii="Century Schoolbook" w:hAnsi="Century Schoolbook"/>
-          <w:b/>
-          <w:bCs/>
-        </w:rPr>
-        <w:t>english</w:t>
-      </w:r>
-      <w:proofErr w:type="spellEnd"/>
-      <w:r>
-        <w:rPr>
-          <w:rFonts w:ascii="Century Schoolbook" w:hAnsi="Century Schoolbook"/>
-          <w:b/>
-          <w:bCs/>
-        </w:rPr>
-        <w:t>’</w:t>
+      <w:r>
+        <w:rPr>
+          <w:rFonts w:ascii="Century Schoolbook" w:hAnsi="Century Schoolbook"/>
+          <w:b/>
+          <w:bCs/>
+        </w:rPr>
+        <w:t>stop_words='english’</w:t>
       </w:r>
       <w:r>
         <w:rPr>
@@ -2345,23 +2376,13 @@
         </w:rPr>
         <w:t xml:space="preserve">. Change this parameter to </w:t>
       </w:r>
-      <w:proofErr w:type="spellStart"/>
-      <w:r>
-        <w:rPr>
-          <w:rFonts w:ascii="Century Schoolbook" w:hAnsi="Century Schoolbook"/>
-          <w:b/>
-          <w:bCs/>
-        </w:rPr>
-        <w:t>stop_words</w:t>
-      </w:r>
-      <w:proofErr w:type="spellEnd"/>
-      <w:r>
-        <w:rPr>
-          <w:rFonts w:ascii="Century Schoolbook" w:hAnsi="Century Schoolbook"/>
-          <w:b/>
-          <w:bCs/>
-        </w:rPr>
-        <w:t>=None</w:t>
+      <w:r>
+        <w:rPr>
+          <w:rFonts w:ascii="Century Schoolbook" w:hAnsi="Century Schoolbook"/>
+          <w:b/>
+          <w:bCs/>
+        </w:rPr>
+        <w:t>stop_words=None</w:t>
       </w:r>
       <w:r>
         <w:rPr>
@@ -2369,7 +2390,6 @@
         </w:rPr>
         <w:t xml:space="preserve"> and re-run the cell to check the shape of </w:t>
       </w:r>
-      <w:proofErr w:type="spellStart"/>
       <w:r>
         <w:rPr>
           <w:rFonts w:ascii="Century Schoolbook" w:hAnsi="Century Schoolbook"/>
@@ -2378,7 +2398,6 @@
         </w:rPr>
         <w:t>X_counts</w:t>
       </w:r>
-      <w:proofErr w:type="spellEnd"/>
       <w:r>
         <w:rPr>
           <w:rFonts w:ascii="Century Schoolbook" w:hAnsi="Century Schoolbook"/>
@@ -2457,21 +2476,7 @@
         <w:rPr>
           <w:rFonts w:ascii="Century Schoolbook" w:hAnsi="Century Schoolbook"/>
         </w:rPr>
-        <w:t xml:space="preserve">Since </w:t>
-      </w:r>
-      <w:proofErr w:type="spellStart"/>
-      <w:r>
-        <w:rPr>
-          <w:rFonts w:ascii="Century Schoolbook" w:hAnsi="Century Schoolbook"/>
-        </w:rPr>
-        <w:t>stopwords</w:t>
-      </w:r>
-      <w:proofErr w:type="spellEnd"/>
-      <w:r>
-        <w:rPr>
-          <w:rFonts w:ascii="Century Schoolbook" w:hAnsi="Century Schoolbook"/>
-        </w:rPr>
-        <w:t xml:space="preserve"> are highly common words that appear in almost all documents, what effect does adding them back have on the overall sparsity (the percentage of zeros) of the matrix?</w:t>
+        <w:t>Since stopwords are highly common words that appear in almost all documents, what effect does adding them back have on the overall sparsity (the percentage of zeros) of the matrix?</w:t>
       </w:r>
     </w:p>
     <w:p>
@@ -2525,6 +2530,7 @@
           <w:b/>
           <w:bCs/>
         </w:rPr>
+        <w:lastRenderedPageBreak/>
         <w:t>If yes, how:</w:t>
       </w:r>
       <w:r>
@@ -2615,7 +2621,6 @@
         <w:rPr>
           <w:rFonts w:ascii="Century Schoolbook" w:hAnsi="Century Schoolbook"/>
         </w:rPr>
-        <w:lastRenderedPageBreak/>
         <w:pict w14:anchorId="5994C8B3">
           <v:rect id="_x0000_i1031" style="width:0;height:1.5pt" o:hralign="center" o:hrstd="t" o:hr="t" fillcolor="#a0a0a0" stroked="f"/>
         </w:pict>
@@ -2704,23 +2709,13 @@
         </w:rPr>
         <w:t xml:space="preserve">In the variance filtering section, re-run </w:t>
       </w:r>
-      <w:proofErr w:type="spellStart"/>
-      <w:r>
-        <w:rPr>
-          <w:rFonts w:ascii="Century Schoolbook" w:hAnsi="Century Schoolbook"/>
-          <w:b/>
-          <w:bCs/>
-        </w:rPr>
-        <w:t>variance_filter</w:t>
-      </w:r>
-      <w:proofErr w:type="spellEnd"/>
-      <w:r>
-        <w:rPr>
-          <w:rFonts w:ascii="Century Schoolbook" w:hAnsi="Century Schoolbook"/>
-          <w:b/>
-          <w:bCs/>
-        </w:rPr>
-        <w:t xml:space="preserve"> </w:t>
+      <w:r>
+        <w:rPr>
+          <w:rFonts w:ascii="Century Schoolbook" w:hAnsi="Century Schoolbook"/>
+          <w:b/>
+          <w:bCs/>
+        </w:rPr>
+        <w:t xml:space="preserve">variance_filter </w:t>
       </w:r>
       <w:r>
         <w:rPr>
@@ -3223,7 +3218,6 @@
         <w:rPr>
           <w:rFonts w:ascii="Century Schoolbook" w:hAnsi="Century Schoolbook"/>
         </w:rPr>
-        <w:lastRenderedPageBreak/>
         <w:pict w14:anchorId="3BE467AD">
           <v:rect id="_x0000_i1032" style="width:0;height:1.5pt" o:hralign="center" o:hrstd="t" o:hr="t" fillcolor="#a0a0a0" stroked="f"/>
         </w:pict>
@@ -3304,8 +3298,6 @@
         </w:rPr>
         <w:t xml:space="preserve">Run the correlation filter against the binary indicator for the </w:t>
       </w:r>
-      <w:proofErr w:type="spellStart"/>
-      <w:proofErr w:type="gramStart"/>
       <w:r>
         <w:rPr>
           <w:rFonts w:ascii="Century Schoolbook" w:hAnsi="Century Schoolbook"/>
@@ -3314,15 +3306,12 @@
         </w:rPr>
         <w:t>comp.graphics</w:t>
       </w:r>
-      <w:proofErr w:type="spellEnd"/>
-      <w:proofErr w:type="gramEnd"/>
       <w:r>
         <w:rPr>
           <w:rFonts w:ascii="Century Schoolbook" w:hAnsi="Century Schoolbook"/>
         </w:rPr>
         <w:t xml:space="preserve"> class. Inspect the top 10 features sorted by </w:t>
       </w:r>
-      <w:proofErr w:type="spellStart"/>
       <w:r>
         <w:rPr>
           <w:rFonts w:ascii="Century Schoolbook" w:hAnsi="Century Schoolbook"/>
@@ -3331,14 +3320,12 @@
         </w:rPr>
         <w:t>pearson_r</w:t>
       </w:r>
-      <w:proofErr w:type="spellEnd"/>
       <w:r>
         <w:rPr>
           <w:rFonts w:ascii="Century Schoolbook" w:hAnsi="Century Schoolbook"/>
         </w:rPr>
         <w:t xml:space="preserve"> and compare them to the top 10 features sorted by </w:t>
       </w:r>
-      <w:proofErr w:type="spellStart"/>
       <w:r>
         <w:rPr>
           <w:rFonts w:ascii="Century Schoolbook" w:hAnsi="Century Schoolbook"/>
@@ -3347,7 +3334,6 @@
         </w:rPr>
         <w:t>spearman_r</w:t>
       </w:r>
-      <w:proofErr w:type="spellEnd"/>
       <w:r>
         <w:rPr>
           <w:rFonts w:ascii="Century Schoolbook" w:hAnsi="Century Schoolbook"/>
@@ -3657,23 +3643,13 @@
         </w:rPr>
         <w:t xml:space="preserve">In the Frequent Pattern Mining section, run </w:t>
       </w:r>
-      <w:proofErr w:type="gramStart"/>
-      <w:r>
-        <w:rPr>
-          <w:rFonts w:ascii="Century Schoolbook" w:hAnsi="Century Schoolbook"/>
-          <w:b/>
-          <w:bCs/>
-        </w:rPr>
-        <w:t>Top-K</w:t>
-      </w:r>
-      <w:proofErr w:type="gramEnd"/>
-      <w:r>
-        <w:rPr>
-          <w:rFonts w:ascii="Century Schoolbook" w:hAnsi="Century Schoolbook"/>
-          <w:b/>
-          <w:bCs/>
-        </w:rPr>
-        <w:t xml:space="preserve"> FAE</w:t>
+      <w:r>
+        <w:rPr>
+          <w:rFonts w:ascii="Century Schoolbook" w:hAnsi="Century Schoolbook"/>
+          <w:b/>
+          <w:bCs/>
+        </w:rPr>
+        <w:t>Top-K FAE</w:t>
       </w:r>
       <w:r>
         <w:rPr>
@@ -3695,7 +3671,6 @@
         </w:rPr>
         <w:t xml:space="preserve">. Then, run </w:t>
       </w:r>
-      <w:proofErr w:type="spellStart"/>
       <w:r>
         <w:rPr>
           <w:rFonts w:ascii="Century Schoolbook" w:hAnsi="Century Schoolbook"/>
@@ -3704,48 +3679,19 @@
         </w:rPr>
         <w:t>MaxFPGrowth</w:t>
       </w:r>
-      <w:proofErr w:type="spellEnd"/>
       <w:r>
         <w:rPr>
           <w:rFonts w:ascii="Century Schoolbook" w:hAnsi="Century Schoolbook"/>
         </w:rPr>
         <w:t xml:space="preserve"> using minimum support thresholds </w:t>
       </w:r>
-      <w:proofErr w:type="spellStart"/>
-      <w:r>
-        <w:rPr>
-          <w:rFonts w:ascii="Century Schoolbook" w:hAnsi="Century Schoolbook"/>
-          <w:b/>
-          <w:bCs/>
-        </w:rPr>
-        <w:t>minSup</w:t>
-      </w:r>
-      <w:proofErr w:type="spellEnd"/>
-      <w:r>
-        <w:rPr>
-          <w:rFonts w:ascii="Century Schoolbook" w:hAnsi="Century Schoolbook"/>
-          <w:b/>
-          <w:bCs/>
-        </w:rPr>
-        <w:t xml:space="preserve">=9 and </w:t>
-      </w:r>
-      <w:proofErr w:type="spellStart"/>
-      <w:r>
-        <w:rPr>
-          <w:rFonts w:ascii="Century Schoolbook" w:hAnsi="Century Schoolbook"/>
-          <w:b/>
-          <w:bCs/>
-        </w:rPr>
-        <w:t>minSup</w:t>
-      </w:r>
-      <w:proofErr w:type="spellEnd"/>
-      <w:r>
-        <w:rPr>
-          <w:rFonts w:ascii="Century Schoolbook" w:hAnsi="Century Schoolbook"/>
-          <w:b/>
-          <w:bCs/>
-        </w:rPr>
-        <w:t>= 3</w:t>
+      <w:r>
+        <w:rPr>
+          <w:rFonts w:ascii="Century Schoolbook" w:hAnsi="Century Schoolbook"/>
+          <w:b/>
+          <w:bCs/>
+        </w:rPr>
+        <w:t>minSup=9 and minSup= 3</w:t>
       </w:r>
       <w:r>
         <w:rPr>
@@ -3790,7 +3736,6 @@
         </w:rPr>
         <w:t xml:space="preserve">How does decreasing </w:t>
       </w:r>
-      <w:proofErr w:type="spellStart"/>
       <w:r>
         <w:rPr>
           <w:rFonts w:ascii="Century Schoolbook" w:hAnsi="Century Schoolbook"/>
@@ -3799,14 +3744,12 @@
         </w:rPr>
         <w:t>minSup</w:t>
       </w:r>
-      <w:proofErr w:type="spellEnd"/>
       <w:r>
         <w:rPr>
           <w:rFonts w:ascii="Century Schoolbook" w:hAnsi="Century Schoolbook"/>
         </w:rPr>
         <w:t xml:space="preserve"> (from 9 to 3) in </w:t>
       </w:r>
-      <w:proofErr w:type="spellStart"/>
       <w:r>
         <w:rPr>
           <w:rFonts w:ascii="Century Schoolbook" w:hAnsi="Century Schoolbook"/>
@@ -3815,7 +3758,6 @@
         </w:rPr>
         <w:t>MaxFPGrowth</w:t>
       </w:r>
-      <w:proofErr w:type="spellEnd"/>
       <w:r>
         <w:rPr>
           <w:rFonts w:ascii="Century Schoolbook" w:hAnsi="Century Schoolbook"/>
@@ -3841,23 +3783,13 @@
         </w:rPr>
         <w:t xml:space="preserve">How does the parameter k in </w:t>
       </w:r>
-      <w:proofErr w:type="gramStart"/>
-      <w:r>
-        <w:rPr>
-          <w:rFonts w:ascii="Century Schoolbook" w:hAnsi="Century Schoolbook"/>
-          <w:b/>
-          <w:bCs/>
-        </w:rPr>
-        <w:t>Top-K</w:t>
-      </w:r>
-      <w:proofErr w:type="gramEnd"/>
-      <w:r>
-        <w:rPr>
-          <w:rFonts w:ascii="Century Schoolbook" w:hAnsi="Century Schoolbook"/>
-          <w:b/>
-          <w:bCs/>
-        </w:rPr>
-        <w:t xml:space="preserve"> FAE</w:t>
+      <w:r>
+        <w:rPr>
+          <w:rFonts w:ascii="Century Schoolbook" w:hAnsi="Century Schoolbook"/>
+          <w:b/>
+          <w:bCs/>
+        </w:rPr>
+        <w:t>Top-K FAE</w:t>
       </w:r>
       <w:r>
         <w:rPr>
@@ -3865,7 +3797,6 @@
         </w:rPr>
         <w:t xml:space="preserve"> differ fundamentally from </w:t>
       </w:r>
-      <w:proofErr w:type="spellStart"/>
       <w:r>
         <w:rPr>
           <w:rFonts w:ascii="Century Schoolbook" w:hAnsi="Century Schoolbook"/>
@@ -3874,14 +3805,12 @@
         </w:rPr>
         <w:t>minSup</w:t>
       </w:r>
-      <w:proofErr w:type="spellEnd"/>
       <w:r>
         <w:rPr>
           <w:rFonts w:ascii="Century Schoolbook" w:hAnsi="Century Schoolbook"/>
         </w:rPr>
         <w:t xml:space="preserve"> in </w:t>
       </w:r>
-      <w:proofErr w:type="spellStart"/>
       <w:r>
         <w:rPr>
           <w:rFonts w:ascii="Century Schoolbook" w:hAnsi="Century Schoolbook"/>
@@ -3890,7 +3819,6 @@
         </w:rPr>
         <w:t>MaxFPGrowth</w:t>
       </w:r>
-      <w:proofErr w:type="spellEnd"/>
       <w:r>
         <w:rPr>
           <w:rFonts w:ascii="Century Schoolbook" w:hAnsi="Century Schoolbook"/>
@@ -3914,6 +3842,7 @@
         <w:rPr>
           <w:rFonts w:ascii="Century Schoolbook" w:hAnsi="Century Schoolbook"/>
         </w:rPr>
+        <w:lastRenderedPageBreak/>
         <w:t>Why are "maximal" frequent patterns structurally more concise than standard frequent patterns?</w:t>
       </w:r>
     </w:p>
@@ -3930,147 +3859,39 @@
           <w:b/>
           <w:bCs/>
         </w:rPr>
-        <w:t>Answer (</w:t>
-      </w:r>
-      <w:proofErr w:type="gramStart"/>
-      <w:r>
-        <w:rPr>
-          <w:rFonts w:ascii="Century Schoolbook" w:hAnsi="Century Schoolbook"/>
-          <w:b/>
-          <w:bCs/>
-        </w:rPr>
-        <w:t>1) —</w:t>
-      </w:r>
-      <w:proofErr w:type="gramEnd"/>
-      <w:r>
-        <w:rPr>
-          <w:rFonts w:ascii="Century Schoolbook" w:hAnsi="Century Schoolbook"/>
-          <w:b/>
-          <w:bCs/>
-        </w:rPr>
-        <w:t xml:space="preserve"> Runtime and pattern count when lowering </w:t>
-      </w:r>
-      <w:proofErr w:type="spellStart"/>
-      <w:r>
-        <w:rPr>
-          <w:rFonts w:ascii="Century Schoolbook" w:hAnsi="Century Schoolbook"/>
-          <w:b/>
-          <w:bCs/>
-        </w:rPr>
-        <w:t>minSup</w:t>
-      </w:r>
-      <w:proofErr w:type="spellEnd"/>
-      <w:r>
-        <w:rPr>
-          <w:rFonts w:ascii="Century Schoolbook" w:hAnsi="Century Schoolbook"/>
-          <w:b/>
-          <w:bCs/>
-        </w:rPr>
-        <w:t>:</w:t>
-      </w:r>
-    </w:p>
-    <w:p>
-      <w:pPr>
-        <w:jc w:val="both"/>
-        <w:rPr>
-          <w:rFonts w:ascii="Century Schoolbook" w:hAnsi="Century Schoolbook"/>
-        </w:rPr>
-      </w:pPr>
-      <w:r>
-        <w:rPr>
-          <w:rFonts w:ascii="Century Schoolbook" w:hAnsi="Century Schoolbook"/>
-          <w:b/>
-          <w:bCs/>
-        </w:rPr>
-        <w:t>Answer (</w:t>
-      </w:r>
-      <w:proofErr w:type="gramStart"/>
-      <w:r>
-        <w:rPr>
-          <w:rFonts w:ascii="Century Schoolbook" w:hAnsi="Century Schoolbook"/>
-          <w:b/>
-          <w:bCs/>
-        </w:rPr>
-        <w:t>2) —</w:t>
-      </w:r>
-      <w:proofErr w:type="gramEnd"/>
-      <w:r>
-        <w:rPr>
-          <w:rFonts w:ascii="Century Schoolbook" w:hAnsi="Century Schoolbook"/>
-          <w:b/>
-          <w:bCs/>
-        </w:rPr>
-        <w:t xml:space="preserve"> Top-K k vs </w:t>
-      </w:r>
-      <w:proofErr w:type="spellStart"/>
-      <w:r>
-        <w:rPr>
-          <w:rFonts w:ascii="Century Schoolbook" w:hAnsi="Century Schoolbook"/>
-          <w:b/>
-          <w:bCs/>
-        </w:rPr>
-        <w:t>MaxFPGrowth</w:t>
-      </w:r>
-      <w:proofErr w:type="spellEnd"/>
-      <w:r>
-        <w:rPr>
-          <w:rFonts w:ascii="Century Schoolbook" w:hAnsi="Century Schoolbook"/>
-          <w:b/>
-          <w:bCs/>
-        </w:rPr>
-        <w:t xml:space="preserve"> </w:t>
-      </w:r>
-      <w:proofErr w:type="spellStart"/>
-      <w:r>
-        <w:rPr>
-          <w:rFonts w:ascii="Century Schoolbook" w:hAnsi="Century Schoolbook"/>
-          <w:b/>
-          <w:bCs/>
-        </w:rPr>
-        <w:t>minSup</w:t>
-      </w:r>
-      <w:proofErr w:type="spellEnd"/>
-      <w:r>
-        <w:rPr>
-          <w:rFonts w:ascii="Century Schoolbook" w:hAnsi="Century Schoolbook"/>
-          <w:b/>
-          <w:bCs/>
-        </w:rPr>
-        <w:t>:</w:t>
-      </w:r>
-    </w:p>
-    <w:p>
-      <w:pPr>
-        <w:jc w:val="both"/>
-        <w:rPr>
-          <w:rFonts w:ascii="Century Schoolbook" w:hAnsi="Century Schoolbook"/>
-        </w:rPr>
-      </w:pPr>
-      <w:r>
-        <w:rPr>
-          <w:rFonts w:ascii="Century Schoolbook" w:hAnsi="Century Schoolbook"/>
-          <w:b/>
-          <w:bCs/>
-        </w:rPr>
-        <w:t>Answer (</w:t>
-      </w:r>
-      <w:proofErr w:type="gramStart"/>
-      <w:r>
-        <w:rPr>
-          <w:rFonts w:ascii="Century Schoolbook" w:hAnsi="Century Schoolbook"/>
-          <w:b/>
-          <w:bCs/>
-        </w:rPr>
-        <w:t>3) —</w:t>
-      </w:r>
-      <w:proofErr w:type="gramEnd"/>
-      <w:r>
-        <w:rPr>
-          <w:rFonts w:ascii="Century Schoolbook" w:hAnsi="Century Schoolbook"/>
-          <w:b/>
-          <w:bCs/>
-        </w:rPr>
-        <w:t xml:space="preserve"> Maximal vs standard frequent patterns:</w:t>
+        <w:t>Answer (1) — Runtime and pattern count when lowering minSup:</w:t>
+      </w:r>
+    </w:p>
+    <w:p>
+      <w:pPr>
+        <w:jc w:val="both"/>
+        <w:rPr>
+          <w:rFonts w:ascii="Century Schoolbook" w:hAnsi="Century Schoolbook"/>
+        </w:rPr>
+      </w:pPr>
+      <w:r>
+        <w:rPr>
+          <w:rFonts w:ascii="Century Schoolbook" w:hAnsi="Century Schoolbook"/>
+          <w:b/>
+          <w:bCs/>
+        </w:rPr>
+        <w:t>Answer (2) — Top-K k vs MaxFPGrowth minSup:</w:t>
+      </w:r>
+    </w:p>
+    <w:p>
+      <w:pPr>
+        <w:jc w:val="both"/>
+        <w:rPr>
+          <w:rFonts w:ascii="Century Schoolbook" w:hAnsi="Century Schoolbook"/>
+        </w:rPr>
+      </w:pPr>
+      <w:r>
+        <w:rPr>
+          <w:rFonts w:ascii="Century Schoolbook" w:hAnsi="Century Schoolbook"/>
+          <w:b/>
+          <w:bCs/>
+        </w:rPr>
+        <w:t>Answer (3) — Maximal vs standard frequent patterns:</w:t>
       </w:r>
     </w:p>
     <w:p>
@@ -4170,7 +3991,6 @@
           <w:b/>
           <w:bCs/>
         </w:rPr>
-        <w:lastRenderedPageBreak/>
         <w:t>Question 8: Dimensionality Reduction — Motivation</w:t>
       </w:r>
     </w:p>
@@ -4219,7 +4039,6 @@
         </w:rPr>
         <w:t xml:space="preserve">After text vectorization, the </w:t>
       </w:r>
-      <w:proofErr w:type="spellStart"/>
       <w:r>
         <w:rPr>
           <w:rFonts w:ascii="Century Schoolbook" w:hAnsi="Century Schoolbook"/>
@@ -4228,7 +4047,6 @@
         </w:rPr>
         <w:t>X_counts</w:t>
       </w:r>
-      <w:proofErr w:type="spellEnd"/>
       <w:r>
         <w:rPr>
           <w:rFonts w:ascii="Century Schoolbook" w:hAnsi="Century Schoolbook"/>
@@ -4270,7 +4088,6 @@
         </w:rPr>
         <w:t xml:space="preserve">If we want to visually map how these documents group by category on a scatter plot, why is it mathematically and visually impossible to plot the raw </w:t>
       </w:r>
-      <w:proofErr w:type="spellStart"/>
       <w:r>
         <w:rPr>
           <w:rFonts w:ascii="Century Schoolbook" w:hAnsi="Century Schoolbook"/>
@@ -4279,7 +4096,6 @@
         </w:rPr>
         <w:t>X_counts</w:t>
       </w:r>
-      <w:proofErr w:type="spellEnd"/>
       <w:r>
         <w:rPr>
           <w:rFonts w:ascii="Century Schoolbook" w:hAnsi="Century Schoolbook"/>
@@ -4674,6 +4490,7 @@
           <w:b/>
           <w:bCs/>
         </w:rPr>
+        <w:lastRenderedPageBreak/>
         <w:t>Answer:</w:t>
       </w:r>
     </w:p>
@@ -4794,7 +4611,6 @@
         <w:rPr>
           <w:rFonts w:ascii="Century Schoolbook" w:hAnsi="Century Schoolbook"/>
         </w:rPr>
-        <w:lastRenderedPageBreak/>
         <w:pict w14:anchorId="3E56138F">
           <v:rect id="_x0000_i1036" style="width:0;height:1.5pt" o:hralign="center" o:hrstd="t" o:hr="t" fillcolor="#a0a0a0" stroked="f"/>
         </w:pict>
@@ -4877,7 +4693,6 @@
         </w:rPr>
         <w:t xml:space="preserve"> (integers 0, 1, 2, 3). Then look at the output of </w:t>
       </w:r>
-      <w:proofErr w:type="spellStart"/>
       <w:r>
         <w:rPr>
           <w:rFonts w:ascii="Century Schoolbook" w:hAnsi="Century Schoolbook"/>
@@ -4886,7 +4701,6 @@
         </w:rPr>
         <w:t>LabelBinarizer</w:t>
       </w:r>
-      <w:proofErr w:type="spellEnd"/>
       <w:r>
         <w:rPr>
           <w:rFonts w:ascii="Century Schoolbook" w:hAnsi="Century Schoolbook"/>
@@ -5099,7 +4913,7 @@
 </file>
 
 <file path=word/endnotes.xml><?xml version="1.0" encoding="utf-8"?>
-<w:endnotes xmlns:wpc="http://schemas.microsoft.com/office/word/2010/wordprocessingCanvas" xmlns:cx="http://schemas.microsoft.com/office/drawing/2014/chartex" xmlns:cx1="http://schemas.microsoft.com/office/drawing/2015/9/8/chartex" xmlns:cx2="http://schemas.microsoft.com/office/drawing/2015/10/21/chartex" xmlns:cx3="http://schemas.microsoft.com/office/drawing/2016/5/9/chartex" xmlns:cx4="http://schemas.microsoft.com/office/drawing/2016/5/10/chartex" xmlns:cx5="http://schemas.microsoft.com/office/drawing/2016/5/11/chartex" xmlns:cx6="http://schemas.microsoft.com/office/drawing/2016/5/12/chartex" xmlns:cx7="http://schemas.microsoft.com/office/drawing/2016/5/13/chartex" xmlns:cx8="http://schemas.microsoft.com/office/drawing/2016/5/14/chartex" xmlns:mc="http://schemas.openxmlformats.org/markup-compatibility/2006" xmlns:aink="http://schemas.microsoft.com/office/drawing/2016/ink" xmlns:am3d="http://schemas.microsoft.com/office/drawing/2017/model3d" xmlns:o="urn:schemas-microsoft-com:office:office" xmlns:oel="http://schemas.microsoft.com/office/2019/extlst" xmlns:r="http://schemas.openxmlformats.org/officeDocument/2006/relationships" xmlns:m="http://schemas.openxmlformats.org/officeDocument/2006/math" xmlns:v="urn:schemas-microsoft-com:vml" xmlns:wp14="http://schemas.microsoft.com/office/word/2010/wordprocessingDrawing" xmlns:wp="http://schemas.openxmlformats.org/drawingml/2006/wordprocessingDrawing" xmlns:w10="urn:schemas-microsoft-com:office:word" xmlns:w="http://schemas.openxmlformats.org/wordprocessingml/2006/main" xmlns:w14="http://schemas.microsoft.com/office/word/2010/wordml" xmlns:w15="http://schemas.microsoft.com/office/word/2012/wordml" xmlns:w16cex="http://schemas.microsoft.com/office/word/2018/wordml/cex" xmlns:w16cid="http://schemas.microsoft.com/office/word/2016/wordml/cid" xmlns:w16="http://schemas.microsoft.com/office/word/2018/wordml" xmlns:w16du="http://schemas.microsoft.com/office/word/2023/wordml/word16du" xmlns:w16sdtdh="http://schemas.microsoft.com/office/word/2020/wordml/sdtdatahash" xmlns:w16sdtfl="http://schemas.microsoft.com/office/word/2024/wordml/sdtformatlock" xmlns:w16se="http://schemas.microsoft.com/office/word/2015/wordml/symex" xmlns:wpg="http://schemas.microsoft.com/office/word/2010/wordprocessingGroup" xmlns:wpi="http://schemas.microsoft.com/office/word/2010/wordprocessingInk" xmlns:wne="http://schemas.microsoft.com/office/word/2006/wordml" xmlns:wps="http://schemas.microsoft.com/office/word/2010/wordprocessingShape" mc:Ignorable="w14 w15 w16se w16cid w16 w16cex w16sdtdh w16sdtfl w16du wp14">
+<w:endnotes xmlns:wpc="http://schemas.microsoft.com/office/word/2010/wordprocessingCanvas" xmlns:mc="http://schemas.openxmlformats.org/markup-compatibility/2006" xmlns:o="urn:schemas-microsoft-com:office:office" xmlns:r="http://schemas.openxmlformats.org/officeDocument/2006/relationships" xmlns:m="http://schemas.openxmlformats.org/officeDocument/2006/math" xmlns:v="urn:schemas-microsoft-com:vml" xmlns:wp14="http://schemas.microsoft.com/office/word/2010/wordprocessingDrawing" xmlns:wp="http://schemas.openxmlformats.org/drawingml/2006/wordprocessingDrawing" xmlns:w10="urn:schemas-microsoft-com:office:word" xmlns:w="http://schemas.openxmlformats.org/wordprocessingml/2006/main" xmlns:w14="http://schemas.microsoft.com/office/word/2010/wordml" xmlns:w15="http://schemas.microsoft.com/office/word/2012/wordml" xmlns:wpg="http://schemas.microsoft.com/office/word/2010/wordprocessingGroup" xmlns:wpi="http://schemas.microsoft.com/office/word/2010/wordprocessingInk" xmlns:wne="http://schemas.microsoft.com/office/word/2006/wordml" xmlns:wps="http://schemas.microsoft.com/office/word/2010/wordprocessingShape" mc:Ignorable="w14 w15 wp14">
   <w:endnote w:type="separator" w:id="-1">
     <w:p>
       <w:pPr>
@@ -5124,7 +4938,7 @@
 </file>
 
 <file path=word/footnotes.xml><?xml version="1.0" encoding="utf-8"?>
-<w:footnotes xmlns:wpc="http://schemas.microsoft.com/office/word/2010/wordprocessingCanvas" xmlns:cx="http://schemas.microsoft.com/office/drawing/2014/chartex" xmlns:cx1="http://schemas.microsoft.com/office/drawing/2015/9/8/chartex" xmlns:cx2="http://schemas.microsoft.com/office/drawing/2015/10/21/chartex" xmlns:cx3="http://schemas.microsoft.com/office/drawing/2016/5/9/chartex" xmlns:cx4="http://schemas.microsoft.com/office/drawing/2016/5/10/chartex" xmlns:cx5="http://schemas.microsoft.com/office/drawing/2016/5/11/chartex" xmlns:cx6="http://schemas.microsoft.com/office/drawing/2016/5/12/chartex" xmlns:cx7="http://schemas.microsoft.com/office/drawing/2016/5/13/chartex" xmlns:cx8="http://schemas.microsoft.com/office/drawing/2016/5/14/chartex" xmlns:mc="http://schemas.openxmlformats.org/markup-compatibility/2006" xmlns:aink="http://schemas.microsoft.com/office/drawing/2016/ink" xmlns:am3d="http://schemas.microsoft.com/office/drawing/2017/model3d" xmlns:o="urn:schemas-microsoft-com:office:office" xmlns:oel="http://schemas.microsoft.com/office/2019/extlst" xmlns:r="http://schemas.openxmlformats.org/officeDocument/2006/relationships" xmlns:m="http://schemas.openxmlformats.org/officeDocument/2006/math" xmlns:v="urn:schemas-microsoft-com:vml" xmlns:wp14="http://schemas.microsoft.com/office/word/2010/wordprocessingDrawing" xmlns:wp="http://schemas.openxmlformats.org/drawingml/2006/wordprocessingDrawing" xmlns:w10="urn:schemas-microsoft-com:office:word" xmlns:w="http://schemas.openxmlformats.org/wordprocessingml/2006/main" xmlns:w14="http://schemas.microsoft.com/office/word/2010/wordml" xmlns:w15="http://schemas.microsoft.com/office/word/2012/wordml" xmlns:w16cex="http://schemas.microsoft.com/office/word/2018/wordml/cex" xmlns:w16cid="http://schemas.microsoft.com/office/word/2016/wordml/cid" xmlns:w16="http://schemas.microsoft.com/office/word/2018/wordml" xmlns:w16du="http://schemas.microsoft.com/office/word/2023/wordml/word16du" xmlns:w16sdtdh="http://schemas.microsoft.com/office/word/2020/wordml/sdtdatahash" xmlns:w16sdtfl="http://schemas.microsoft.com/office/word/2024/wordml/sdtformatlock" xmlns:w16se="http://schemas.microsoft.com/office/word/2015/wordml/symex" xmlns:wpg="http://schemas.microsoft.com/office/word/2010/wordprocessingGroup" xmlns:wpi="http://schemas.microsoft.com/office/word/2010/wordprocessingInk" xmlns:wne="http://schemas.microsoft.com/office/word/2006/wordml" xmlns:wps="http://schemas.microsoft.com/office/word/2010/wordprocessingShape" mc:Ignorable="w14 w15 w16se w16cid w16 w16cex w16sdtdh w16sdtfl w16du wp14">
+<w:footnotes xmlns:wpc="http://schemas.microsoft.com/office/word/2010/wordprocessingCanvas" xmlns:mc="http://schemas.openxmlformats.org/markup-compatibility/2006" xmlns:o="urn:schemas-microsoft-com:office:office" xmlns:r="http://schemas.openxmlformats.org/officeDocument/2006/relationships" xmlns:m="http://schemas.openxmlformats.org/officeDocument/2006/math" xmlns:v="urn:schemas-microsoft-com:vml" xmlns:wp14="http://schemas.microsoft.com/office/word/2010/wordprocessingDrawing" xmlns:wp="http://schemas.openxmlformats.org/drawingml/2006/wordprocessingDrawing" xmlns:w10="urn:schemas-microsoft-com:office:word" xmlns:w="http://schemas.openxmlformats.org/wordprocessingml/2006/main" xmlns:w14="http://schemas.microsoft.com/office/word/2010/wordml" xmlns:w15="http://schemas.microsoft.com/office/word/2012/wordml" xmlns:wpg="http://schemas.microsoft.com/office/word/2010/wordprocessingGroup" xmlns:wpi="http://schemas.microsoft.com/office/word/2010/wordprocessingInk" xmlns:wne="http://schemas.microsoft.com/office/word/2006/wordml" xmlns:wps="http://schemas.microsoft.com/office/word/2010/wordprocessingShape" mc:Ignorable="w14 w15 wp14">
   <w:footnote w:type="separator" w:id="-1">
     <w:p>
       <w:pPr>
@@ -5149,7 +4963,7 @@
 </file>
 
 <file path=word/numbering.xml><?xml version="1.0" encoding="utf-8"?>
-<w:numbering xmlns:wpc="http://schemas.microsoft.com/office/word/2010/wordprocessingCanvas" xmlns:cx="http://schemas.microsoft.com/office/drawing/2014/chartex" xmlns:cx1="http://schemas.microsoft.com/office/drawing/2015/9/8/chartex" xmlns:cx2="http://schemas.microsoft.com/office/drawing/2015/10/21/chartex" xmlns:cx3="http://schemas.microsoft.com/office/drawing/2016/5/9/chartex" xmlns:cx4="http://schemas.microsoft.com/office/drawing/2016/5/10/chartex" xmlns:cx5="http://schemas.microsoft.com/office/drawing/2016/5/11/chartex" xmlns:cx6="http://schemas.microsoft.com/office/drawing/2016/5/12/chartex" xmlns:cx7="http://schemas.microsoft.com/office/drawing/2016/5/13/chartex" xmlns:cx8="http://schemas.microsoft.com/office/drawing/2016/5/14/chartex" xmlns:mc="http://schemas.openxmlformats.org/markup-compatibility/2006" xmlns:aink="http://schemas.microsoft.com/office/drawing/2016/ink" xmlns:am3d="http://schemas.microsoft.com/office/drawing/2017/model3d" xmlns:o="urn:schemas-microsoft-com:office:office" xmlns:oel="http://schemas.microsoft.com/office/2019/extlst" xmlns:r="http://schemas.openxmlformats.org/officeDocument/2006/relationships" xmlns:m="http://schemas.openxmlformats.org/officeDocument/2006/math" xmlns:v="urn:schemas-microsoft-com:vml" xmlns:wp14="http://schemas.microsoft.com/office/word/2010/wordprocessingDrawing" xmlns:wp="http://schemas.openxmlformats.org/drawingml/2006/wordprocessingDrawing" xmlns:w10="urn:schemas-microsoft-com:office:word" xmlns:w="http://schemas.openxmlformats.org/wordprocessingml/2006/main" xmlns:w14="http://schemas.microsoft.com/office/word/2010/wordml" xmlns:w15="http://schemas.microsoft.com/office/word/2012/wordml" xmlns:w16cex="http://schemas.microsoft.com/office/word/2018/wordml/cex" xmlns:w16cid="http://schemas.microsoft.com/office/word/2016/wordml/cid" xmlns:w16="http://schemas.microsoft.com/office/word/2018/wordml" xmlns:w16du="http://schemas.microsoft.com/office/word/2023/wordml/word16du" xmlns:w16sdtdh="http://schemas.microsoft.com/office/word/2020/wordml/sdtdatahash" xmlns:w16sdtfl="http://schemas.microsoft.com/office/word/2024/wordml/sdtformatlock" xmlns:w16se="http://schemas.microsoft.com/office/word/2015/wordml/symex" xmlns:wpg="http://schemas.microsoft.com/office/word/2010/wordprocessingGroup" xmlns:wpi="http://schemas.microsoft.com/office/word/2010/wordprocessingInk" xmlns:wne="http://schemas.microsoft.com/office/word/2006/wordml" xmlns:wps="http://schemas.microsoft.com/office/word/2010/wordprocessingShape" mc:Ignorable="w14 w15 w16se w16cid w16 w16cex w16sdtdh w16sdtfl w16du wp14">
+<w:numbering xmlns:wpc="http://schemas.microsoft.com/office/word/2010/wordprocessingCanvas" xmlns:mc="http://schemas.openxmlformats.org/markup-compatibility/2006" xmlns:o="urn:schemas-microsoft-com:office:office" xmlns:r="http://schemas.openxmlformats.org/officeDocument/2006/relationships" xmlns:m="http://schemas.openxmlformats.org/officeDocument/2006/math" xmlns:v="urn:schemas-microsoft-com:vml" xmlns:wp14="http://schemas.microsoft.com/office/word/2010/wordprocessingDrawing" xmlns:wp="http://schemas.openxmlformats.org/drawingml/2006/wordprocessingDrawing" xmlns:w10="urn:schemas-microsoft-com:office:word" xmlns:w="http://schemas.openxmlformats.org/wordprocessingml/2006/main" xmlns:w14="http://schemas.microsoft.com/office/word/2010/wordml" xmlns:w15="http://schemas.microsoft.com/office/word/2012/wordml" xmlns:wpg="http://schemas.microsoft.com/office/word/2010/wordprocessingGroup" xmlns:wpi="http://schemas.microsoft.com/office/word/2010/wordprocessingInk" xmlns:wne="http://schemas.microsoft.com/office/word/2006/wordml" xmlns:wps="http://schemas.microsoft.com/office/word/2010/wordprocessingShape" mc:Ignorable="w14 w15 wp14">
   <w:abstractNum w:abstractNumId="0" w15:restartNumberingAfterBreak="0">
     <w:nsid w:val="02604484"/>
     <w:multiLevelType w:val="multilevel"/>
@@ -6576,6 +6390,96 @@
     </w:lvl>
   </w:abstractNum>
   <w:abstractNum w:abstractNumId="12" w15:restartNumberingAfterBreak="0">
+    <w:nsid w:val="4FEE2DCD"/>
+    <w:multiLevelType w:val="hybridMultilevel"/>
+    <w:tmpl w:val="7C02C068"/>
+    <w:lvl w:ilvl="0" w:tplc="14705514">
+      <w:start w:val="1"/>
+      <w:numFmt w:val="decimal"/>
+      <w:lvlText w:val="%1."/>
+      <w:lvlJc w:val="left"/>
+      <w:pPr>
+        <w:ind w:left="720" w:hanging="360"/>
+      </w:pPr>
+      <w:rPr>
+        <w:rFonts w:hint="default"/>
+        <w:b/>
+      </w:rPr>
+    </w:lvl>
+    <w:lvl w:ilvl="1" w:tplc="04090019" w:tentative="1">
+      <w:start w:val="1"/>
+      <w:numFmt w:val="lowerLetter"/>
+      <w:lvlText w:val="%2."/>
+      <w:lvlJc w:val="left"/>
+      <w:pPr>
+        <w:ind w:left="1440" w:hanging="360"/>
+      </w:pPr>
+    </w:lvl>
+    <w:lvl w:ilvl="2" w:tplc="0409001B" w:tentative="1">
+      <w:start w:val="1"/>
+      <w:numFmt w:val="lowerRoman"/>
+      <w:lvlText w:val="%3."/>
+      <w:lvlJc w:val="right"/>
+      <w:pPr>
+        <w:ind w:left="2160" w:hanging="180"/>
+      </w:pPr>
+    </w:lvl>
+    <w:lvl w:ilvl="3" w:tplc="0409000F" w:tentative="1">
+      <w:start w:val="1"/>
+      <w:numFmt w:val="decimal"/>
+      <w:lvlText w:val="%4."/>
+      <w:lvlJc w:val="left"/>
+      <w:pPr>
+        <w:ind w:left="2880" w:hanging="360"/>
+      </w:pPr>
+    </w:lvl>
+    <w:lvl w:ilvl="4" w:tplc="04090019" w:tentative="1">
+      <w:start w:val="1"/>
+      <w:numFmt w:val="lowerLetter"/>
+      <w:lvlText w:val="%5."/>
+      <w:lvlJc w:val="left"/>
+      <w:pPr>
+        <w:ind w:left="3600" w:hanging="360"/>
+      </w:pPr>
+    </w:lvl>
+    <w:lvl w:ilvl="5" w:tplc="0409001B" w:tentative="1">
+      <w:start w:val="1"/>
+      <w:numFmt w:val="lowerRoman"/>
+      <w:lvlText w:val="%6."/>
+      <w:lvlJc w:val="right"/>
+      <w:pPr>
+        <w:ind w:left="4320" w:hanging="180"/>
+      </w:pPr>
+    </w:lvl>
+    <w:lvl w:ilvl="6" w:tplc="0409000F" w:tentative="1">
+      <w:start w:val="1"/>
+      <w:numFmt w:val="decimal"/>
+      <w:lvlText w:val="%7."/>
+      <w:lvlJc w:val="left"/>
+      <w:pPr>
+        <w:ind w:left="5040" w:hanging="360"/>
+      </w:pPr>
+    </w:lvl>
+    <w:lvl w:ilvl="7" w:tplc="04090019" w:tentative="1">
+      <w:start w:val="1"/>
+      <w:numFmt w:val="lowerLetter"/>
+      <w:lvlText w:val="%8."/>
+      <w:lvlJc w:val="left"/>
+      <w:pPr>
+        <w:ind w:left="5760" w:hanging="360"/>
+      </w:pPr>
+    </w:lvl>
+    <w:lvl w:ilvl="8" w:tplc="0409001B" w:tentative="1">
+      <w:start w:val="1"/>
+      <w:numFmt w:val="lowerRoman"/>
+      <w:lvlText w:val="%9."/>
+      <w:lvlJc w:val="right"/>
+      <w:pPr>
+        <w:ind w:left="6480" w:hanging="180"/>
+      </w:pPr>
+    </w:lvl>
+  </w:abstractNum>
+  <w:abstractNum w:abstractNumId="13" w15:restartNumberingAfterBreak="0">
     <w:nsid w:val="50686C5F"/>
     <w:multiLevelType w:val="multilevel"/>
     <w:tmpl w:val="9F2C0B54"/>
@@ -6688,7 +6592,7 @@
       </w:pPr>
     </w:lvl>
   </w:abstractNum>
-  <w:abstractNum w:abstractNumId="13" w15:restartNumberingAfterBreak="0">
+  <w:abstractNum w:abstractNumId="14" w15:restartNumberingAfterBreak="0">
     <w:nsid w:val="510B6AF3"/>
     <w:multiLevelType w:val="hybridMultilevel"/>
     <w:tmpl w:val="6B0E57B6"/>
@@ -6828,7 +6732,7 @@
       </w:rPr>
     </w:lvl>
   </w:abstractNum>
-  <w:abstractNum w:abstractNumId="14" w15:restartNumberingAfterBreak="0">
+  <w:abstractNum w:abstractNumId="15" w15:restartNumberingAfterBreak="0">
     <w:nsid w:val="576A4380"/>
     <w:multiLevelType w:val="hybridMultilevel"/>
     <w:tmpl w:val="7F86CB26"/>
@@ -6914,7 +6818,7 @@
       </w:pPr>
     </w:lvl>
   </w:abstractNum>
-  <w:abstractNum w:abstractNumId="15" w15:restartNumberingAfterBreak="0">
+  <w:abstractNum w:abstractNumId="16" w15:restartNumberingAfterBreak="0">
     <w:nsid w:val="600745AA"/>
     <w:multiLevelType w:val="hybridMultilevel"/>
     <w:tmpl w:val="7BCE176C"/>
@@ -7054,7 +6958,7 @@
       </w:rPr>
     </w:lvl>
   </w:abstractNum>
-  <w:abstractNum w:abstractNumId="16" w15:restartNumberingAfterBreak="0">
+  <w:abstractNum w:abstractNumId="17" w15:restartNumberingAfterBreak="0">
     <w:nsid w:val="63660093"/>
     <w:multiLevelType w:val="multilevel"/>
     <w:tmpl w:val="487AC5E8"/>
@@ -7167,7 +7071,7 @@
       </w:pPr>
     </w:lvl>
   </w:abstractNum>
-  <w:abstractNum w:abstractNumId="17" w15:restartNumberingAfterBreak="0">
+  <w:abstractNum w:abstractNumId="18" w15:restartNumberingAfterBreak="0">
     <w:nsid w:val="66633041"/>
     <w:multiLevelType w:val="hybridMultilevel"/>
     <w:tmpl w:val="F3BAEAD8"/>
@@ -7307,7 +7211,7 @@
       </w:rPr>
     </w:lvl>
   </w:abstractNum>
-  <w:abstractNum w:abstractNumId="18" w15:restartNumberingAfterBreak="0">
+  <w:abstractNum w:abstractNumId="19" w15:restartNumberingAfterBreak="0">
     <w:nsid w:val="67445AD2"/>
     <w:multiLevelType w:val="hybridMultilevel"/>
     <w:tmpl w:val="C4DE3054"/>
@@ -7447,7 +7351,7 @@
       </w:rPr>
     </w:lvl>
   </w:abstractNum>
-  <w:abstractNum w:abstractNumId="19" w15:restartNumberingAfterBreak="0">
+  <w:abstractNum w:abstractNumId="20" w15:restartNumberingAfterBreak="0">
     <w:nsid w:val="6E5869E4"/>
     <w:multiLevelType w:val="multilevel"/>
     <w:tmpl w:val="22AC937C"/>
@@ -7560,7 +7464,7 @@
       </w:pPr>
     </w:lvl>
   </w:abstractNum>
-  <w:abstractNum w:abstractNumId="20" w15:restartNumberingAfterBreak="0">
+  <w:abstractNum w:abstractNumId="21" w15:restartNumberingAfterBreak="0">
     <w:nsid w:val="6F90345B"/>
     <w:multiLevelType w:val="multilevel"/>
     <w:tmpl w:val="76CCD152"/>
@@ -7673,7 +7577,7 @@
       </w:pPr>
     </w:lvl>
   </w:abstractNum>
-  <w:abstractNum w:abstractNumId="21" w15:restartNumberingAfterBreak="0">
+  <w:abstractNum w:abstractNumId="22" w15:restartNumberingAfterBreak="0">
     <w:nsid w:val="745C3AEA"/>
     <w:multiLevelType w:val="hybridMultilevel"/>
     <w:tmpl w:val="AB2AF8BA"/>
@@ -7786,7 +7690,7 @@
       </w:rPr>
     </w:lvl>
   </w:abstractNum>
-  <w:abstractNum w:abstractNumId="22" w15:restartNumberingAfterBreak="0">
+  <w:abstractNum w:abstractNumId="23" w15:restartNumberingAfterBreak="0">
     <w:nsid w:val="755D4AD5"/>
     <w:multiLevelType w:val="multilevel"/>
     <w:tmpl w:val="1AF6A79A"/>
@@ -7935,7 +7839,7 @@
       </w:rPr>
     </w:lvl>
   </w:abstractNum>
-  <w:abstractNum w:abstractNumId="23" w15:restartNumberingAfterBreak="0">
+  <w:abstractNum w:abstractNumId="24" w15:restartNumberingAfterBreak="0">
     <w:nsid w:val="7D601873"/>
     <w:multiLevelType w:val="multilevel"/>
     <w:tmpl w:val="6660EE9E"/>
@@ -8084,83 +7988,86 @@
       </w:rPr>
     </w:lvl>
   </w:abstractNum>
-  <w:num w:numId="1" w16cid:durableId="178129358">
+  <w:num w:numId="1">
     <w:abstractNumId w:val="7"/>
   </w:num>
-  <w:num w:numId="2" w16cid:durableId="184292703">
-    <w:abstractNumId w:val="12"/>
+  <w:num w:numId="2">
+    <w:abstractNumId w:val="13"/>
   </w:num>
-  <w:num w:numId="3" w16cid:durableId="1575118697">
+  <w:num w:numId="3">
     <w:abstractNumId w:val="0"/>
   </w:num>
-  <w:num w:numId="4" w16cid:durableId="731463887">
+  <w:num w:numId="4">
+    <w:abstractNumId w:val="23"/>
+  </w:num>
+  <w:num w:numId="5">
+    <w:abstractNumId w:val="2"/>
+  </w:num>
+  <w:num w:numId="6">
+    <w:abstractNumId w:val="5"/>
+  </w:num>
+  <w:num w:numId="7">
+    <w:abstractNumId w:val="21"/>
+  </w:num>
+  <w:num w:numId="8">
+    <w:abstractNumId w:val="8"/>
+  </w:num>
+  <w:num w:numId="9">
+    <w:abstractNumId w:val="20"/>
+  </w:num>
+  <w:num w:numId="10">
+    <w:abstractNumId w:val="17"/>
+  </w:num>
+  <w:num w:numId="11">
+    <w:abstractNumId w:val="10"/>
+  </w:num>
+  <w:num w:numId="12">
+    <w:abstractNumId w:val="11"/>
+  </w:num>
+  <w:num w:numId="13">
+    <w:abstractNumId w:val="24"/>
+  </w:num>
+  <w:num w:numId="14">
     <w:abstractNumId w:val="22"/>
   </w:num>
-  <w:num w:numId="5" w16cid:durableId="619185889">
-    <w:abstractNumId w:val="2"/>
+  <w:num w:numId="15">
+    <w:abstractNumId w:val="3"/>
   </w:num>
-  <w:num w:numId="6" w16cid:durableId="1071270425">
-    <w:abstractNumId w:val="5"/>
+  <w:num w:numId="16">
+    <w:abstractNumId w:val="14"/>
   </w:num>
-  <w:num w:numId="7" w16cid:durableId="1588727719">
-    <w:abstractNumId w:val="20"/>
+  <w:num w:numId="17">
+    <w:abstractNumId w:val="16"/>
   </w:num>
-  <w:num w:numId="8" w16cid:durableId="533738981">
-    <w:abstractNumId w:val="8"/>
-  </w:num>
-  <w:num w:numId="9" w16cid:durableId="1269434050">
+  <w:num w:numId="18">
     <w:abstractNumId w:val="19"/>
   </w:num>
-  <w:num w:numId="10" w16cid:durableId="1732079054">
-    <w:abstractNumId w:val="16"/>
+  <w:num w:numId="19">
+    <w:abstractNumId w:val="9"/>
   </w:num>
-  <w:num w:numId="11" w16cid:durableId="1035348155">
-    <w:abstractNumId w:val="10"/>
-  </w:num>
-  <w:num w:numId="12" w16cid:durableId="1142964469">
-    <w:abstractNumId w:val="11"/>
-  </w:num>
-  <w:num w:numId="13" w16cid:durableId="1675378421">
-    <w:abstractNumId w:val="23"/>
-  </w:num>
-  <w:num w:numId="14" w16cid:durableId="815490794">
-    <w:abstractNumId w:val="21"/>
-  </w:num>
-  <w:num w:numId="15" w16cid:durableId="1567035629">
-    <w:abstractNumId w:val="3"/>
-  </w:num>
-  <w:num w:numId="16" w16cid:durableId="1944191802">
-    <w:abstractNumId w:val="13"/>
-  </w:num>
-  <w:num w:numId="17" w16cid:durableId="467089125">
+  <w:num w:numId="20">
     <w:abstractNumId w:val="15"/>
   </w:num>
-  <w:num w:numId="18" w16cid:durableId="771702364">
+  <w:num w:numId="21">
+    <w:abstractNumId w:val="4"/>
+  </w:num>
+  <w:num w:numId="22">
+    <w:abstractNumId w:val="1"/>
+  </w:num>
+  <w:num w:numId="23">
+    <w:abstractNumId w:val="6"/>
+  </w:num>
+  <w:num w:numId="24">
     <w:abstractNumId w:val="18"/>
   </w:num>
-  <w:num w:numId="19" w16cid:durableId="893585597">
-    <w:abstractNumId w:val="9"/>
-  </w:num>
-  <w:num w:numId="20" w16cid:durableId="5520643">
-    <w:abstractNumId w:val="14"/>
-  </w:num>
-  <w:num w:numId="21" w16cid:durableId="1673995430">
-    <w:abstractNumId w:val="4"/>
-  </w:num>
-  <w:num w:numId="22" w16cid:durableId="1335179808">
-    <w:abstractNumId w:val="1"/>
-  </w:num>
-  <w:num w:numId="23" w16cid:durableId="347214929">
-    <w:abstractNumId w:val="6"/>
-  </w:num>
-  <w:num w:numId="24" w16cid:durableId="1413353911">
-    <w:abstractNumId w:val="17"/>
+  <w:num w:numId="25">
+    <w:abstractNumId w:val="12"/>
   </w:num>
 </w:numbering>
 </file>
 
 <file path=word/styles.xml><?xml version="1.0" encoding="utf-8"?>
-<w:styles xmlns:mc="http://schemas.openxmlformats.org/markup-compatibility/2006" xmlns:r="http://schemas.openxmlformats.org/officeDocument/2006/relationships" xmlns:w="http://schemas.openxmlformats.org/wordprocessingml/2006/main" xmlns:w14="http://schemas.microsoft.com/office/word/2010/wordml" xmlns:w15="http://schemas.microsoft.com/office/word/2012/wordml" xmlns:w16cex="http://schemas.microsoft.com/office/word/2018/wordml/cex" xmlns:w16cid="http://schemas.microsoft.com/office/word/2016/wordml/cid" xmlns:w16="http://schemas.microsoft.com/office/word/2018/wordml" xmlns:w16du="http://schemas.microsoft.com/office/word/2023/wordml/word16du" xmlns:w16sdtdh="http://schemas.microsoft.com/office/word/2020/wordml/sdtdatahash" xmlns:w16sdtfl="http://schemas.microsoft.com/office/word/2024/wordml/sdtformatlock" xmlns:w16se="http://schemas.microsoft.com/office/word/2015/wordml/symex" mc:Ignorable="w14 w15 w16se w16cid w16 w16cex w16sdtdh w16sdtfl w16du">
+<w:styles xmlns:mc="http://schemas.openxmlformats.org/markup-compatibility/2006" xmlns:r="http://schemas.openxmlformats.org/officeDocument/2006/relationships" xmlns:w="http://schemas.openxmlformats.org/wordprocessingml/2006/main" xmlns:w14="http://schemas.microsoft.com/office/word/2010/wordml" xmlns:w15="http://schemas.microsoft.com/office/word/2012/wordml" mc:Ignorable="w14 w15">
   <w:docDefaults>
     <w:rPrDefault>
       <w:rPr>
@@ -8178,7 +8085,7 @@
       </w:pPr>
     </w:pPrDefault>
   </w:docDefaults>
-  <w:latentStyles w:defLockedState="0" w:defUIPriority="99" w:defSemiHidden="0" w:defUnhideWhenUsed="0" w:defQFormat="0" w:count="376">
+  <w:latentStyles w:defLockedState="0" w:defUIPriority="99" w:defSemiHidden="0" w:defUnhideWhenUsed="0" w:defQFormat="0" w:count="371">
     <w:lsdException w:name="Normal" w:uiPriority="0" w:qFormat="1"/>
     <w:lsdException w:name="heading 1" w:uiPriority="9" w:qFormat="1"/>
     <w:lsdException w:name="heading 2" w:semiHidden="1" w:uiPriority="9" w:unhideWhenUsed="1" w:qFormat="1"/>
@@ -8550,11 +8457,6 @@
     <w:lsdException w:name="List Table 5 Dark Accent 6" w:uiPriority="50"/>
     <w:lsdException w:name="List Table 6 Colorful Accent 6" w:uiPriority="51"/>
     <w:lsdException w:name="List Table 7 Colorful Accent 6" w:uiPriority="52"/>
-    <w:lsdException w:name="Mention" w:semiHidden="1" w:unhideWhenUsed="1"/>
-    <w:lsdException w:name="Smart Hyperlink" w:semiHidden="1" w:unhideWhenUsed="1"/>
-    <w:lsdException w:name="Hashtag" w:semiHidden="1" w:unhideWhenUsed="1"/>
-    <w:lsdException w:name="Unresolved Mention" w:semiHidden="1" w:unhideWhenUsed="1"/>
-    <w:lsdException w:name="Smart Link" w:semiHidden="1" w:unhideWhenUsed="1"/>
   </w:latentStyles>
   <w:style w:type="paragraph" w:default="1" w:styleId="Normal">
     <w:name w:val="Normal"/>
@@ -8762,6 +8664,7 @@
   <w:style w:type="character" w:default="1" w:styleId="DefaultParagraphFont">
     <w:name w:val="Default Paragraph Font"/>
     <w:uiPriority w:val="1"/>
+    <w:semiHidden/>
     <w:unhideWhenUsed/>
   </w:style>
   <w:style w:type="table" w:default="1" w:styleId="TableNormal">

</xml_diff>

<commit_message>
continuation of Master Notebook questions
</commit_message>
<xml_diff>
--- a/DM2026-Lab1-Master-Questions.docx
+++ b/DM2026-Lab1-Master-Questions.docx
@@ -1658,8 +1658,6 @@
         </w:rPr>
         <w:t xml:space="preserve"> </w:t>
       </w:r>
-      <w:bookmarkStart w:id="0" w:name="_GoBack"/>
-      <w:bookmarkEnd w:id="0"/>
     </w:p>
     <w:p>
       <w:pPr>
@@ -1709,6 +1707,12 @@
           <w:rFonts w:ascii="Century Schoolbook" w:hAnsi="Century Schoolbook"/>
         </w:rPr>
         <w:t xml:space="preserve"> </w:t>
+      </w:r>
+      <w:r>
+        <w:rPr>
+          <w:rFonts w:ascii="Century Schoolbook" w:hAnsi="Century Schoolbook"/>
+        </w:rPr>
+        <w:t>https://www.geeksforgeeks.org/dsa/frequent-pattern-mining-in-data-mining/</w:t>
       </w:r>
     </w:p>
     <w:p>
@@ -1892,12 +1896,39 @@
           <w:rFonts w:ascii="Century Schoolbook" w:hAnsi="Century Schoolbook"/>
         </w:rPr>
       </w:pPr>
-      <w:r>
-        <w:rPr>
-          <w:rFonts w:ascii="Century Schoolbook" w:hAnsi="Century Schoolbook"/>
-          <w:b/>
-          <w:bCs/>
-        </w:rPr>
+    </w:p>
+    <w:p>
+      <w:pPr>
+        <w:jc w:val="both"/>
+        <w:rPr>
+          <w:rFonts w:ascii="Century Schoolbook" w:hAnsi="Century Schoolbook"/>
+        </w:rPr>
+      </w:pPr>
+    </w:p>
+    <w:p>
+      <w:pPr>
+        <w:jc w:val="both"/>
+        <w:rPr>
+          <w:rFonts w:ascii="Century Schoolbook" w:hAnsi="Century Schoolbook"/>
+        </w:rPr>
+      </w:pPr>
+    </w:p>
+    <w:p>
+      <w:pPr>
+        <w:jc w:val="both"/>
+        <w:rPr>
+          <w:rFonts w:ascii="Century Schoolbook" w:hAnsi="Century Schoolbook"/>
+          <w:b/>
+          <w:bCs/>
+        </w:rPr>
+      </w:pPr>
+      <w:r>
+        <w:rPr>
+          <w:rFonts w:ascii="Century Schoolbook" w:hAnsi="Century Schoolbook"/>
+          <w:b/>
+          <w:bCs/>
+        </w:rPr>
+        <w:lastRenderedPageBreak/>
         <w:t>Answer:</w:t>
       </w:r>
     </w:p>
@@ -1906,6 +1937,51 @@
         <w:jc w:val="both"/>
         <w:rPr>
           <w:rFonts w:ascii="Century Schoolbook" w:hAnsi="Century Schoolbook"/>
+          <w:bCs/>
+        </w:rPr>
+      </w:pPr>
+      <w:r>
+        <w:rPr>
+          <w:rFonts w:ascii="Century Schoolbook" w:hAnsi="Century Schoolbook"/>
+          <w:bCs/>
+        </w:rPr>
+        <w:t xml:space="preserve">It would be a flawed data mining strategy </w:t>
+      </w:r>
+      <w:r>
+        <w:rPr>
+          <w:rFonts w:ascii="Century Schoolbook" w:hAnsi="Century Schoolbook"/>
+          <w:bCs/>
+        </w:rPr>
+        <w:t>because 40% of the documents would be lost. This would significantly reduce the amount of text available for analysis and could introduce bias if the documents with missing labels have different characteristics from the remaining documents. As a result, potentially useful information and patterns could be overlooked.</w:t>
+      </w:r>
+    </w:p>
+    <w:p>
+      <w:pPr>
+        <w:jc w:val="both"/>
+        <w:rPr>
+          <w:rFonts w:ascii="Century Schoolbook" w:hAnsi="Century Schoolbook"/>
+        </w:rPr>
+      </w:pPr>
+      <w:r>
+        <w:rPr>
+          <w:rFonts w:ascii="Century Schoolbook" w:hAnsi="Century Schoolbook"/>
+          <w:bCs/>
+        </w:rPr>
+        <w:t xml:space="preserve">An </w:t>
+      </w:r>
+      <w:r>
+        <w:rPr>
+          <w:rFonts w:ascii="Century Schoolbook" w:hAnsi="Century Schoolbook"/>
+          <w:bCs/>
+        </w:rPr>
+        <w:t>alternative is unsupervised clustering, which groups documents according to similarities in their text without requiring predefined category labels. This allows the text from documents with missing category_name values to remain useful for analysis and helps identify patterns or topics within the dataset.</w:t>
+      </w:r>
+    </w:p>
+    <w:p>
+      <w:pPr>
+        <w:jc w:val="both"/>
+        <w:rPr>
+          <w:rFonts w:ascii="Century Schoolbook" w:hAnsi="Century Schoolbook"/>
         </w:rPr>
       </w:pPr>
       <w:r>
@@ -1920,7 +1996,7 @@
         <w:rPr>
           <w:rFonts w:ascii="Century Schoolbook" w:hAnsi="Century Schoolbook"/>
         </w:rPr>
-        <w:t xml:space="preserve"> Yes / No </w:t>
+        <w:t xml:space="preserve"> Yes</w:t>
       </w:r>
     </w:p>
     <w:p>
@@ -1944,6 +2020,12 @@
         </w:rPr>
         <w:t xml:space="preserve"> </w:t>
       </w:r>
+      <w:r>
+        <w:rPr>
+          <w:rFonts w:ascii="Century Schoolbook" w:hAnsi="Century Schoolbook"/>
+        </w:rPr>
+        <w:t>To learn more about the alternatives to be taken to resolve this.</w:t>
+      </w:r>
     </w:p>
     <w:p>
       <w:pPr>
@@ -1966,70 +2048,12 @@
         </w:rPr>
         <w:t xml:space="preserve"> </w:t>
       </w:r>
-    </w:p>
-    <w:p>
-      <w:pPr>
-        <w:jc w:val="both"/>
-        <w:rPr>
-          <w:rFonts w:ascii="Century Schoolbook" w:hAnsi="Century Schoolbook"/>
-        </w:rPr>
-      </w:pPr>
-    </w:p>
-    <w:p>
-      <w:pPr>
-        <w:jc w:val="both"/>
-        <w:rPr>
-          <w:rFonts w:ascii="Century Schoolbook" w:hAnsi="Century Schoolbook"/>
-        </w:rPr>
-      </w:pPr>
-    </w:p>
-    <w:p>
-      <w:pPr>
-        <w:jc w:val="both"/>
-        <w:rPr>
-          <w:rFonts w:ascii="Century Schoolbook" w:hAnsi="Century Schoolbook"/>
-        </w:rPr>
-      </w:pPr>
-    </w:p>
-    <w:p>
-      <w:pPr>
-        <w:jc w:val="both"/>
-        <w:rPr>
-          <w:rFonts w:ascii="Century Schoolbook" w:hAnsi="Century Schoolbook"/>
-        </w:rPr>
-      </w:pPr>
-    </w:p>
-    <w:p>
-      <w:pPr>
-        <w:jc w:val="both"/>
-        <w:rPr>
-          <w:rFonts w:ascii="Century Schoolbook" w:hAnsi="Century Schoolbook"/>
-        </w:rPr>
-      </w:pPr>
-    </w:p>
-    <w:p>
-      <w:pPr>
-        <w:jc w:val="both"/>
-        <w:rPr>
-          <w:rFonts w:ascii="Century Schoolbook" w:hAnsi="Century Schoolbook"/>
-        </w:rPr>
-      </w:pPr>
-    </w:p>
-    <w:p>
-      <w:pPr>
-        <w:jc w:val="both"/>
-        <w:rPr>
-          <w:rFonts w:ascii="Century Schoolbook" w:hAnsi="Century Schoolbook"/>
-        </w:rPr>
-      </w:pPr>
-    </w:p>
-    <w:p>
-      <w:pPr>
-        <w:jc w:val="both"/>
-        <w:rPr>
-          <w:rFonts w:ascii="Century Schoolbook" w:hAnsi="Century Schoolbook"/>
-        </w:rPr>
-      </w:pPr>
+      <w:r>
+        <w:rPr>
+          <w:rFonts w:ascii="Century Schoolbook" w:hAnsi="Century Schoolbook"/>
+        </w:rPr>
+        <w:t>https://www.geeksforgeeks.org/data-analysis/handling-missing-values-machine-learning/</w:t>
+      </w:r>
     </w:p>
     <w:p>
       <w:pPr>
@@ -2188,6 +2212,8 @@
         <w:jc w:val="both"/>
         <w:rPr>
           <w:rFonts w:ascii="Century Schoolbook" w:hAnsi="Century Schoolbook"/>
+          <w:b/>
+          <w:bCs/>
         </w:rPr>
       </w:pPr>
       <w:r>
@@ -2201,6 +2227,56 @@
     </w:p>
     <w:p>
       <w:pPr>
+        <w:pStyle w:val="ListParagraph"/>
+        <w:numPr>
+          <w:ilvl w:val="0"/>
+          <w:numId w:val="26"/>
+        </w:numPr>
+        <w:jc w:val="both"/>
+        <w:rPr>
+          <w:rFonts w:ascii="Century Schoolbook" w:hAnsi="Century Schoolbook"/>
+        </w:rPr>
+      </w:pPr>
+      <w:r>
+        <w:rPr>
+          <w:rFonts w:ascii="Century Schoolbook" w:hAnsi="Century Schoolbook"/>
+        </w:rPr>
+        <w:t>No, not perfectly, but they remain relatively the same</w:t>
+      </w:r>
+      <w:r>
+        <w:rPr>
+          <w:rFonts w:ascii="Century Schoolbook" w:hAnsi="Century Schoolbook"/>
+        </w:rPr>
+        <w:t>.</w:t>
+      </w:r>
+    </w:p>
+    <w:p>
+      <w:pPr>
+        <w:pStyle w:val="ListParagraph"/>
+        <w:numPr>
+          <w:ilvl w:val="0"/>
+          <w:numId w:val="26"/>
+        </w:numPr>
+        <w:jc w:val="both"/>
+        <w:rPr>
+          <w:rFonts w:ascii="Century Schoolbook" w:hAnsi="Century Schoolbook"/>
+        </w:rPr>
+      </w:pPr>
+      <w:r>
+        <w:rPr>
+          <w:rFonts w:ascii="Century Schoolbook" w:hAnsi="Century Schoolbook"/>
+        </w:rPr>
+        <w:t>The risk is that minority classes can become too small or disappear in the sample, causing bias and poor analysis results</w:t>
+      </w:r>
+      <w:r>
+        <w:rPr>
+          <w:rFonts w:ascii="Century Schoolbook" w:hAnsi="Century Schoolbook"/>
+        </w:rPr>
+        <w:t>.</w:t>
+      </w:r>
+    </w:p>
+    <w:p>
+      <w:pPr>
         <w:jc w:val="both"/>
         <w:rPr>
           <w:rFonts w:ascii="Century Schoolbook" w:hAnsi="Century Schoolbook"/>
@@ -2218,7 +2294,13 @@
         <w:rPr>
           <w:rFonts w:ascii="Century Schoolbook" w:hAnsi="Century Schoolbook"/>
         </w:rPr>
-        <w:t xml:space="preserve"> Yes / No </w:t>
+        <w:t xml:space="preserve"> </w:t>
+      </w:r>
+      <w:r>
+        <w:rPr>
+          <w:rFonts w:ascii="Century Schoolbook" w:hAnsi="Century Schoolbook"/>
+        </w:rPr>
+        <w:t xml:space="preserve">No </w:t>
       </w:r>
     </w:p>
     <w:p>
@@ -2426,6 +2508,7 @@
           <w:b/>
           <w:bCs/>
         </w:rPr>
+        <w:lastRenderedPageBreak/>
         <w:t>Questions:</w:t>
       </w:r>
     </w:p>
@@ -2484,6 +2567,8 @@
         <w:jc w:val="both"/>
         <w:rPr>
           <w:rFonts w:ascii="Century Schoolbook" w:hAnsi="Century Schoolbook"/>
+          <w:b/>
+          <w:bCs/>
         </w:rPr>
       </w:pPr>
       <w:r>
@@ -2497,6 +2582,62 @@
     </w:p>
     <w:p>
       <w:pPr>
+        <w:pStyle w:val="ListParagraph"/>
+        <w:numPr>
+          <w:ilvl w:val="1"/>
+          <w:numId w:val="7"/>
+        </w:numPr>
+        <w:jc w:val="both"/>
+        <w:rPr>
+          <w:rFonts w:ascii="Century Schoolbook" w:hAnsi="Century Schoolbook"/>
+        </w:rPr>
+      </w:pPr>
+      <w:r>
+        <w:rPr>
+          <w:rFonts w:ascii="Century Schoolbook" w:hAnsi="Century Schoolbook"/>
+        </w:rPr>
+        <w:t>It increases.</w:t>
+      </w:r>
+    </w:p>
+    <w:p>
+      <w:pPr>
+        <w:pStyle w:val="ListParagraph"/>
+        <w:numPr>
+          <w:ilvl w:val="1"/>
+          <w:numId w:val="7"/>
+        </w:numPr>
+        <w:jc w:val="both"/>
+        <w:rPr>
+          <w:rFonts w:ascii="Century Schoolbook" w:hAnsi="Century Schoolbook"/>
+        </w:rPr>
+      </w:pPr>
+      <w:r>
+        <w:rPr>
+          <w:rFonts w:ascii="Century Schoolbook" w:hAnsi="Century Schoolbook"/>
+        </w:rPr>
+        <w:t xml:space="preserve">Adding stopwords </w:t>
+      </w:r>
+      <w:r>
+        <w:rPr>
+          <w:rFonts w:ascii="Century Schoolbook" w:hAnsi="Century Schoolbook"/>
+        </w:rPr>
+        <w:t>decreases the overall sparsity of the matrix because common words appear in many documents. Including these words adds more non-zero entries to the document-term matrix, reducing the percentage of zeros.</w:t>
+      </w:r>
+      <w:r>
+        <w:rPr>
+          <w:rFonts w:ascii="Century Schoolbook" w:hAnsi="Century Schoolbook"/>
+        </w:rPr>
+        <w:t xml:space="preserve"> </w:t>
+      </w:r>
+      <w:r>
+        <w:rPr>
+          <w:rFonts w:ascii="Century Schoolbook" w:hAnsi="Century Schoolbook"/>
+        </w:rPr>
+        <w:t>However, the matrix will still be sparse because most documents contain only a small fraction of all the words in the vocabulary.</w:t>
+      </w:r>
+    </w:p>
+    <w:p>
+      <w:pPr>
         <w:jc w:val="both"/>
         <w:rPr>
           <w:rFonts w:ascii="Century Schoolbook" w:hAnsi="Century Schoolbook"/>
@@ -2514,23 +2655,28 @@
         <w:rPr>
           <w:rFonts w:ascii="Century Schoolbook" w:hAnsi="Century Schoolbook"/>
         </w:rPr>
-        <w:t xml:space="preserve"> Yes / No </w:t>
-      </w:r>
-    </w:p>
-    <w:p>
-      <w:pPr>
-        <w:jc w:val="both"/>
-        <w:rPr>
-          <w:rFonts w:ascii="Century Schoolbook" w:hAnsi="Century Schoolbook"/>
-        </w:rPr>
-      </w:pPr>
-      <w:r>
-        <w:rPr>
-          <w:rFonts w:ascii="Century Schoolbook" w:hAnsi="Century Schoolbook"/>
-          <w:b/>
-          <w:bCs/>
-        </w:rPr>
-        <w:lastRenderedPageBreak/>
+        <w:t xml:space="preserve"> Yes</w:t>
+      </w:r>
+      <w:r>
+        <w:rPr>
+          <w:rFonts w:ascii="Century Schoolbook" w:hAnsi="Century Schoolbook"/>
+        </w:rPr>
+        <w:t xml:space="preserve"> </w:t>
+      </w:r>
+    </w:p>
+    <w:p>
+      <w:pPr>
+        <w:jc w:val="both"/>
+        <w:rPr>
+          <w:rFonts w:ascii="Century Schoolbook" w:hAnsi="Century Schoolbook"/>
+        </w:rPr>
+      </w:pPr>
+      <w:r>
+        <w:rPr>
+          <w:rFonts w:ascii="Century Schoolbook" w:hAnsi="Century Schoolbook"/>
+          <w:b/>
+          <w:bCs/>
+        </w:rPr>
         <w:t>If yes, how:</w:t>
       </w:r>
       <w:r>
@@ -2539,6 +2685,18 @@
         </w:rPr>
         <w:t xml:space="preserve"> </w:t>
       </w:r>
+      <w:r>
+        <w:rPr>
+          <w:rFonts w:ascii="Century Schoolbook" w:hAnsi="Century Schoolbook"/>
+        </w:rPr>
+        <w:t xml:space="preserve">In explaining </w:t>
+      </w:r>
+      <w:r>
+        <w:rPr>
+          <w:rFonts w:ascii="Century Schoolbook" w:hAnsi="Century Schoolbook"/>
+        </w:rPr>
+        <w:t>how including stopwords affects the number of features and the sparsity of the matrix.</w:t>
+      </w:r>
     </w:p>
     <w:p>
       <w:pPr>
@@ -2561,54 +2719,12 @@
         </w:rPr>
         <w:t xml:space="preserve"> </w:t>
       </w:r>
-    </w:p>
-    <w:p>
-      <w:pPr>
-        <w:jc w:val="both"/>
-        <w:rPr>
-          <w:rFonts w:ascii="Century Schoolbook" w:hAnsi="Century Schoolbook"/>
-        </w:rPr>
-      </w:pPr>
-    </w:p>
-    <w:p>
-      <w:pPr>
-        <w:jc w:val="both"/>
-        <w:rPr>
-          <w:rFonts w:ascii="Century Schoolbook" w:hAnsi="Century Schoolbook"/>
-        </w:rPr>
-      </w:pPr>
-    </w:p>
-    <w:p>
-      <w:pPr>
-        <w:jc w:val="both"/>
-        <w:rPr>
-          <w:rFonts w:ascii="Century Schoolbook" w:hAnsi="Century Schoolbook"/>
-        </w:rPr>
-      </w:pPr>
-    </w:p>
-    <w:p>
-      <w:pPr>
-        <w:jc w:val="both"/>
-        <w:rPr>
-          <w:rFonts w:ascii="Century Schoolbook" w:hAnsi="Century Schoolbook"/>
-        </w:rPr>
-      </w:pPr>
-    </w:p>
-    <w:p>
-      <w:pPr>
-        <w:jc w:val="both"/>
-        <w:rPr>
-          <w:rFonts w:ascii="Century Schoolbook" w:hAnsi="Century Schoolbook"/>
-        </w:rPr>
-      </w:pPr>
-    </w:p>
-    <w:p>
-      <w:pPr>
-        <w:jc w:val="both"/>
-        <w:rPr>
-          <w:rFonts w:ascii="Century Schoolbook" w:hAnsi="Century Schoolbook"/>
-        </w:rPr>
-      </w:pPr>
+      <w:r>
+        <w:rPr>
+          <w:rFonts w:ascii="Century Schoolbook" w:hAnsi="Century Schoolbook"/>
+        </w:rPr>
+        <w:t>https://search.brave.com/search?q=2.%09Since+stopwords+are+highly+common+words+that+appear+in+almost+all+documents%2C+what+effect+does+adding+them+back+have+on+the+overall+sparsity+%28the+percentage+of+zeros%29+of+the+matrix%3F&amp;source=web&amp;conversation=09ae5fb3a7074f4e348db4707a9c8b43bb79&amp;shared=1</w:t>
+      </w:r>
     </w:p>
     <w:p>
       <w:pPr>
@@ -2830,6 +2946,8 @@
         <w:jc w:val="both"/>
         <w:rPr>
           <w:rFonts w:ascii="Century Schoolbook" w:hAnsi="Century Schoolbook"/>
+          <w:b/>
+          <w:bCs/>
         </w:rPr>
       </w:pPr>
       <w:r>
@@ -2839,6 +2957,80 @@
           <w:bCs/>
         </w:rPr>
         <w:t>Answer:</w:t>
+      </w:r>
+    </w:p>
+    <w:p>
+      <w:pPr>
+        <w:pStyle w:val="ListParagraph"/>
+        <w:numPr>
+          <w:ilvl w:val="1"/>
+          <w:numId w:val="19"/>
+        </w:numPr>
+        <w:jc w:val="both"/>
+        <w:rPr>
+          <w:rFonts w:ascii="Century Schoolbook" w:hAnsi="Century Schoolbook"/>
+        </w:rPr>
+      </w:pPr>
+      <w:r>
+        <w:rPr>
+          <w:rFonts w:ascii="Century Schoolbook" w:hAnsi="Century Schoolbook"/>
+        </w:rPr>
+        <w:t>The total vocabulary size decreases as the variance threshold increases. At a threshold of 0.0, 35,482 features are kept. At 0.01, only 5,089 features remain, and at 0.05, only 1,491 features remain. This shows that increasing the threshold removes more low-variance features and reduces the dimensionality of the dataset.</w:t>
+      </w:r>
+    </w:p>
+    <w:p>
+      <w:pPr>
+        <w:jc w:val="both"/>
+        <w:rPr>
+          <w:rFonts w:ascii="Century Schoolbook" w:hAnsi="Century Schoolbook"/>
+        </w:rPr>
+      </w:pPr>
+    </w:p>
+    <w:p>
+      <w:pPr>
+        <w:pStyle w:val="ListParagraph"/>
+        <w:numPr>
+          <w:ilvl w:val="1"/>
+          <w:numId w:val="19"/>
+        </w:numPr>
+        <w:jc w:val="both"/>
+        <w:rPr>
+          <w:rFonts w:ascii="Century Schoolbook" w:hAnsi="Century Schoolbook"/>
+        </w:rPr>
+      </w:pPr>
+      <w:r>
+        <w:rPr>
+          <w:rFonts w:ascii="Century Schoolbook" w:hAnsi="Century Schoolbook"/>
+        </w:rPr>
+        <w:lastRenderedPageBreak/>
+        <w:t>Words that appear in almost every document or in very few documents have low variance because their occurrence does not vary much across the dataset. These words provide limited information for distinguishing documents and are among the first to be eliminated as the variance threshold increases.</w:t>
+      </w:r>
+    </w:p>
+    <w:p>
+      <w:pPr>
+        <w:pStyle w:val="ListParagraph"/>
+        <w:rPr>
+          <w:rFonts w:ascii="Century Schoolbook" w:hAnsi="Century Schoolbook"/>
+        </w:rPr>
+      </w:pPr>
+    </w:p>
+    <w:p>
+      <w:pPr>
+        <w:pStyle w:val="ListParagraph"/>
+        <w:numPr>
+          <w:ilvl w:val="1"/>
+          <w:numId w:val="19"/>
+        </w:numPr>
+        <w:jc w:val="both"/>
+        <w:rPr>
+          <w:rFonts w:ascii="Century Schoolbook" w:hAnsi="Century Schoolbook"/>
+        </w:rPr>
+      </w:pPr>
+      <w:r>
+        <w:rPr>
+          <w:rFonts w:ascii="Century Schoolbook" w:hAnsi="Century Schoolbook"/>
+        </w:rPr>
+        <w:t>Near-zero variance features provide little variation between documents, so they often contribute limited information for distinguishing categories. Removing them reduces the number of features, memory usage, and computational cost while potentially improving model efficiency. However, it is not guaranteed to preserve accuracy in every case, so model performance should be evaluated after filtering.</w:t>
       </w:r>
     </w:p>
     <w:tbl>
@@ -2936,6 +3128,18 @@
               </w:rPr>
               <w:t>0.0</w:t>
             </w:r>
+            <w:r>
+              <w:rPr>
+                <w:rFonts w:ascii="Century Schoolbook" w:hAnsi="Century Schoolbook"/>
+              </w:rPr>
+              <w:t xml:space="preserve"> - </w:t>
+            </w:r>
+            <w:r>
+              <w:rPr>
+                <w:rFonts w:ascii="Century Schoolbook" w:hAnsi="Century Schoolbook"/>
+              </w:rPr>
+              <w:t>35482</w:t>
+            </w:r>
           </w:p>
         </w:tc>
         <w:tc>
@@ -2976,6 +3180,18 @@
                 <w:rFonts w:ascii="Century Schoolbook" w:hAnsi="Century Schoolbook"/>
               </w:rPr>
               <w:t>0.01</w:t>
+            </w:r>
+            <w:r>
+              <w:rPr>
+                <w:rFonts w:ascii="Century Schoolbook" w:hAnsi="Century Schoolbook"/>
+              </w:rPr>
+              <w:t xml:space="preserve"> - </w:t>
+            </w:r>
+            <w:r>
+              <w:rPr>
+                <w:rFonts w:ascii="Century Schoolbook" w:hAnsi="Century Schoolbook"/>
+              </w:rPr>
+              <w:t>5089</w:t>
             </w:r>
           </w:p>
         </w:tc>
@@ -3018,6 +3234,18 @@
               </w:rPr>
               <w:t>0.05</w:t>
             </w:r>
+            <w:r>
+              <w:rPr>
+                <w:rFonts w:ascii="Century Schoolbook" w:hAnsi="Century Schoolbook"/>
+              </w:rPr>
+              <w:t xml:space="preserve"> - </w:t>
+            </w:r>
+            <w:r>
+              <w:rPr>
+                <w:rFonts w:ascii="Century Schoolbook" w:hAnsi="Century Schoolbook"/>
+              </w:rPr>
+              <w:t>1491</w:t>
+            </w:r>
           </w:p>
         </w:tc>
         <w:tc>
@@ -3056,7 +3284,13 @@
         <w:rPr>
           <w:rFonts w:ascii="Century Schoolbook" w:hAnsi="Century Schoolbook"/>
         </w:rPr>
-        <w:t xml:space="preserve"> Yes / No </w:t>
+        <w:t xml:space="preserve"> Yes</w:t>
+      </w:r>
+      <w:r>
+        <w:rPr>
+          <w:rFonts w:ascii="Century Schoolbook" w:hAnsi="Century Schoolbook"/>
+        </w:rPr>
+        <w:t xml:space="preserve"> </w:t>
       </w:r>
     </w:p>
     <w:p>
@@ -3080,6 +3314,18 @@
         </w:rPr>
         <w:t xml:space="preserve"> </w:t>
       </w:r>
+      <w:r>
+        <w:rPr>
+          <w:rFonts w:ascii="Century Schoolbook" w:hAnsi="Century Schoolbook"/>
+        </w:rPr>
+        <w:t>In e</w:t>
+      </w:r>
+      <w:r>
+        <w:rPr>
+          <w:rFonts w:ascii="Century Schoolbook" w:hAnsi="Century Schoolbook"/>
+        </w:rPr>
+        <w:t>xplain how increasing the threshold affects vocabulary size, document frequency, and dimensionality reduction.</w:t>
+      </w:r>
     </w:p>
     <w:p>
       <w:pPr>
@@ -3102,110 +3348,14 @@
         </w:rPr>
         <w:t xml:space="preserve"> </w:t>
       </w:r>
-    </w:p>
-    <w:p>
-      <w:pPr>
-        <w:jc w:val="both"/>
-        <w:rPr>
-          <w:rFonts w:ascii="Century Schoolbook" w:hAnsi="Century Schoolbook"/>
-        </w:rPr>
-      </w:pPr>
-    </w:p>
-    <w:p>
-      <w:pPr>
-        <w:jc w:val="both"/>
-        <w:rPr>
-          <w:rFonts w:ascii="Century Schoolbook" w:hAnsi="Century Schoolbook"/>
-        </w:rPr>
-      </w:pPr>
-    </w:p>
-    <w:p>
-      <w:pPr>
-        <w:jc w:val="both"/>
-        <w:rPr>
-          <w:rFonts w:ascii="Century Schoolbook" w:hAnsi="Century Schoolbook"/>
-        </w:rPr>
-      </w:pPr>
-    </w:p>
-    <w:p>
-      <w:pPr>
-        <w:jc w:val="both"/>
-        <w:rPr>
-          <w:rFonts w:ascii="Century Schoolbook" w:hAnsi="Century Schoolbook"/>
-        </w:rPr>
-      </w:pPr>
-    </w:p>
-    <w:p>
-      <w:pPr>
-        <w:jc w:val="both"/>
-        <w:rPr>
-          <w:rFonts w:ascii="Century Schoolbook" w:hAnsi="Century Schoolbook"/>
-        </w:rPr>
-      </w:pPr>
-    </w:p>
-    <w:p>
-      <w:pPr>
-        <w:jc w:val="both"/>
-        <w:rPr>
-          <w:rFonts w:ascii="Century Schoolbook" w:hAnsi="Century Schoolbook"/>
-        </w:rPr>
-      </w:pPr>
-    </w:p>
-    <w:p>
-      <w:pPr>
-        <w:jc w:val="both"/>
-        <w:rPr>
-          <w:rFonts w:ascii="Century Schoolbook" w:hAnsi="Century Schoolbook"/>
-        </w:rPr>
-      </w:pPr>
-    </w:p>
-    <w:p>
-      <w:pPr>
-        <w:jc w:val="both"/>
-        <w:rPr>
-          <w:rFonts w:ascii="Century Schoolbook" w:hAnsi="Century Schoolbook"/>
-        </w:rPr>
-      </w:pPr>
-    </w:p>
-    <w:p>
-      <w:pPr>
-        <w:jc w:val="both"/>
-        <w:rPr>
-          <w:rFonts w:ascii="Century Schoolbook" w:hAnsi="Century Schoolbook"/>
-        </w:rPr>
-      </w:pPr>
-    </w:p>
-    <w:p>
-      <w:pPr>
-        <w:jc w:val="both"/>
-        <w:rPr>
-          <w:rFonts w:ascii="Century Schoolbook" w:hAnsi="Century Schoolbook"/>
-        </w:rPr>
-      </w:pPr>
-    </w:p>
-    <w:p>
-      <w:pPr>
-        <w:jc w:val="both"/>
-        <w:rPr>
-          <w:rFonts w:ascii="Century Schoolbook" w:hAnsi="Century Schoolbook"/>
-        </w:rPr>
-      </w:pPr>
-    </w:p>
-    <w:p>
-      <w:pPr>
-        <w:jc w:val="both"/>
-        <w:rPr>
-          <w:rFonts w:ascii="Century Schoolbook" w:hAnsi="Century Schoolbook"/>
-        </w:rPr>
-      </w:pPr>
-    </w:p>
-    <w:p>
-      <w:pPr>
-        <w:jc w:val="both"/>
-        <w:rPr>
-          <w:rFonts w:ascii="Century Schoolbook" w:hAnsi="Century Schoolbook"/>
-        </w:rPr>
-      </w:pPr>
+      <w:r>
+        <w:rPr>
+          <w:rFonts w:ascii="Century Schoolbook" w:hAnsi="Century Schoolbook"/>
+        </w:rPr>
+        <w:t>https://search.brave.com/search?q=In+terms+of+document+frequency%2C+what+kinds+of+words+have+variance+close+to+zero+and+are+eliminated+first%3F+In+terms+of+document+frequency%2C+what+kinds+of+words+have+variance+close+to+zero+and+are+eliminated+first%3F&amp;source=desktop&amp;conversation=09aea6fb94febc21c330eae0a8d7a2e395b0&amp;shared=1</w:t>
+      </w:r>
+      <w:bookmarkStart w:id="0" w:name="_GoBack"/>
+      <w:bookmarkEnd w:id="0"/>
     </w:p>
     <w:p>
       <w:pPr>
@@ -3499,6 +3649,7 @@
           <w:b/>
           <w:bCs/>
         </w:rPr>
+        <w:lastRenderedPageBreak/>
         <w:t>AI used for this answer:</w:t>
       </w:r>
       <w:r>
@@ -3842,7 +3993,6 @@
         <w:rPr>
           <w:rFonts w:ascii="Century Schoolbook" w:hAnsi="Century Schoolbook"/>
         </w:rPr>
-        <w:lastRenderedPageBreak/>
         <w:t>Why are "maximal" frequent patterns structurally more concise than standard frequent patterns?</w:t>
       </w:r>
     </w:p>
@@ -4195,6 +4345,7 @@
           <w:b/>
           <w:bCs/>
         </w:rPr>
+        <w:lastRenderedPageBreak/>
         <w:t>External references (links):</w:t>
       </w:r>
       <w:r>
@@ -4490,7 +4641,6 @@
           <w:b/>
           <w:bCs/>
         </w:rPr>
-        <w:lastRenderedPageBreak/>
         <w:t>Answer:</w:t>
       </w:r>
     </w:p>
@@ -4817,6 +4967,7 @@
           <w:b/>
           <w:bCs/>
         </w:rPr>
+        <w:lastRenderedPageBreak/>
         <w:t>Answer:</w:t>
       </w:r>
     </w:p>
@@ -7212,6 +7363,95 @@
     </w:lvl>
   </w:abstractNum>
   <w:abstractNum w:abstractNumId="19" w15:restartNumberingAfterBreak="0">
+    <w:nsid w:val="672424BE"/>
+    <w:multiLevelType w:val="hybridMultilevel"/>
+    <w:tmpl w:val="25545D90"/>
+    <w:lvl w:ilvl="0" w:tplc="0409000F">
+      <w:start w:val="1"/>
+      <w:numFmt w:val="decimal"/>
+      <w:lvlText w:val="%1."/>
+      <w:lvlJc w:val="left"/>
+      <w:pPr>
+        <w:ind w:left="720" w:hanging="360"/>
+      </w:pPr>
+      <w:rPr>
+        <w:rFonts w:hint="default"/>
+      </w:rPr>
+    </w:lvl>
+    <w:lvl w:ilvl="1" w:tplc="04090019" w:tentative="1">
+      <w:start w:val="1"/>
+      <w:numFmt w:val="lowerLetter"/>
+      <w:lvlText w:val="%2."/>
+      <w:lvlJc w:val="left"/>
+      <w:pPr>
+        <w:ind w:left="1440" w:hanging="360"/>
+      </w:pPr>
+    </w:lvl>
+    <w:lvl w:ilvl="2" w:tplc="0409001B" w:tentative="1">
+      <w:start w:val="1"/>
+      <w:numFmt w:val="lowerRoman"/>
+      <w:lvlText w:val="%3."/>
+      <w:lvlJc w:val="right"/>
+      <w:pPr>
+        <w:ind w:left="2160" w:hanging="180"/>
+      </w:pPr>
+    </w:lvl>
+    <w:lvl w:ilvl="3" w:tplc="0409000F" w:tentative="1">
+      <w:start w:val="1"/>
+      <w:numFmt w:val="decimal"/>
+      <w:lvlText w:val="%4."/>
+      <w:lvlJc w:val="left"/>
+      <w:pPr>
+        <w:ind w:left="2880" w:hanging="360"/>
+      </w:pPr>
+    </w:lvl>
+    <w:lvl w:ilvl="4" w:tplc="04090019" w:tentative="1">
+      <w:start w:val="1"/>
+      <w:numFmt w:val="lowerLetter"/>
+      <w:lvlText w:val="%5."/>
+      <w:lvlJc w:val="left"/>
+      <w:pPr>
+        <w:ind w:left="3600" w:hanging="360"/>
+      </w:pPr>
+    </w:lvl>
+    <w:lvl w:ilvl="5" w:tplc="0409001B" w:tentative="1">
+      <w:start w:val="1"/>
+      <w:numFmt w:val="lowerRoman"/>
+      <w:lvlText w:val="%6."/>
+      <w:lvlJc w:val="right"/>
+      <w:pPr>
+        <w:ind w:left="4320" w:hanging="180"/>
+      </w:pPr>
+    </w:lvl>
+    <w:lvl w:ilvl="6" w:tplc="0409000F" w:tentative="1">
+      <w:start w:val="1"/>
+      <w:numFmt w:val="decimal"/>
+      <w:lvlText w:val="%7."/>
+      <w:lvlJc w:val="left"/>
+      <w:pPr>
+        <w:ind w:left="5040" w:hanging="360"/>
+      </w:pPr>
+    </w:lvl>
+    <w:lvl w:ilvl="7" w:tplc="04090019" w:tentative="1">
+      <w:start w:val="1"/>
+      <w:numFmt w:val="lowerLetter"/>
+      <w:lvlText w:val="%8."/>
+      <w:lvlJc w:val="left"/>
+      <w:pPr>
+        <w:ind w:left="5760" w:hanging="360"/>
+      </w:pPr>
+    </w:lvl>
+    <w:lvl w:ilvl="8" w:tplc="0409001B" w:tentative="1">
+      <w:start w:val="1"/>
+      <w:numFmt w:val="lowerRoman"/>
+      <w:lvlText w:val="%9."/>
+      <w:lvlJc w:val="right"/>
+      <w:pPr>
+        <w:ind w:left="6480" w:hanging="180"/>
+      </w:pPr>
+    </w:lvl>
+  </w:abstractNum>
+  <w:abstractNum w:abstractNumId="20" w15:restartNumberingAfterBreak="0">
     <w:nsid w:val="67445AD2"/>
     <w:multiLevelType w:val="hybridMultilevel"/>
     <w:tmpl w:val="C4DE3054"/>
@@ -7351,7 +7591,7 @@
       </w:rPr>
     </w:lvl>
   </w:abstractNum>
-  <w:abstractNum w:abstractNumId="20" w15:restartNumberingAfterBreak="0">
+  <w:abstractNum w:abstractNumId="21" w15:restartNumberingAfterBreak="0">
     <w:nsid w:val="6E5869E4"/>
     <w:multiLevelType w:val="multilevel"/>
     <w:tmpl w:val="22AC937C"/>
@@ -7464,7 +7704,7 @@
       </w:pPr>
     </w:lvl>
   </w:abstractNum>
-  <w:abstractNum w:abstractNumId="21" w15:restartNumberingAfterBreak="0">
+  <w:abstractNum w:abstractNumId="22" w15:restartNumberingAfterBreak="0">
     <w:nsid w:val="6F90345B"/>
     <w:multiLevelType w:val="multilevel"/>
     <w:tmpl w:val="76CCD152"/>
@@ -7577,7 +7817,7 @@
       </w:pPr>
     </w:lvl>
   </w:abstractNum>
-  <w:abstractNum w:abstractNumId="22" w15:restartNumberingAfterBreak="0">
+  <w:abstractNum w:abstractNumId="23" w15:restartNumberingAfterBreak="0">
     <w:nsid w:val="745C3AEA"/>
     <w:multiLevelType w:val="hybridMultilevel"/>
     <w:tmpl w:val="AB2AF8BA"/>
@@ -7690,7 +7930,7 @@
       </w:rPr>
     </w:lvl>
   </w:abstractNum>
-  <w:abstractNum w:abstractNumId="23" w15:restartNumberingAfterBreak="0">
+  <w:abstractNum w:abstractNumId="24" w15:restartNumberingAfterBreak="0">
     <w:nsid w:val="755D4AD5"/>
     <w:multiLevelType w:val="multilevel"/>
     <w:tmpl w:val="1AF6A79A"/>
@@ -7839,7 +8079,7 @@
       </w:rPr>
     </w:lvl>
   </w:abstractNum>
-  <w:abstractNum w:abstractNumId="24" w15:restartNumberingAfterBreak="0">
+  <w:abstractNum w:abstractNumId="25" w15:restartNumberingAfterBreak="0">
     <w:nsid w:val="7D601873"/>
     <w:multiLevelType w:val="multilevel"/>
     <w:tmpl w:val="6660EE9E"/>
@@ -7998,7 +8238,7 @@
     <w:abstractNumId w:val="0"/>
   </w:num>
   <w:num w:numId="4">
-    <w:abstractNumId w:val="23"/>
+    <w:abstractNumId w:val="24"/>
   </w:num>
   <w:num w:numId="5">
     <w:abstractNumId w:val="2"/>
@@ -8007,13 +8247,13 @@
     <w:abstractNumId w:val="5"/>
   </w:num>
   <w:num w:numId="7">
-    <w:abstractNumId w:val="21"/>
+    <w:abstractNumId w:val="22"/>
   </w:num>
   <w:num w:numId="8">
     <w:abstractNumId w:val="8"/>
   </w:num>
   <w:num w:numId="9">
-    <w:abstractNumId w:val="20"/>
+    <w:abstractNumId w:val="21"/>
   </w:num>
   <w:num w:numId="10">
     <w:abstractNumId w:val="17"/>
@@ -8025,10 +8265,10 @@
     <w:abstractNumId w:val="11"/>
   </w:num>
   <w:num w:numId="13">
-    <w:abstractNumId w:val="24"/>
+    <w:abstractNumId w:val="25"/>
   </w:num>
   <w:num w:numId="14">
-    <w:abstractNumId w:val="22"/>
+    <w:abstractNumId w:val="23"/>
   </w:num>
   <w:num w:numId="15">
     <w:abstractNumId w:val="3"/>
@@ -8040,7 +8280,7 @@
     <w:abstractNumId w:val="16"/>
   </w:num>
   <w:num w:numId="18">
-    <w:abstractNumId w:val="19"/>
+    <w:abstractNumId w:val="20"/>
   </w:num>
   <w:num w:numId="19">
     <w:abstractNumId w:val="9"/>
@@ -8062,6 +8302,9 @@
   </w:num>
   <w:num w:numId="25">
     <w:abstractNumId w:val="12"/>
+  </w:num>
+  <w:num w:numId="26">
+    <w:abstractNumId w:val="19"/>
   </w:num>
 </w:numbering>
 </file>

</xml_diff>

<commit_message>
Done with Lab 1 master questions
</commit_message>
<xml_diff>
--- a/DM2026-Lab1-Master-Questions.docx
+++ b/DM2026-Lab1-Master-Questions.docx
@@ -4831,8 +4831,6 @@
         </w:rPr>
         <w:t>https://share.google/aimode/p1FXAdgHOU8CzloOz</w:t>
       </w:r>
-      <w:bookmarkStart w:id="0" w:name="_GoBack"/>
-      <w:bookmarkEnd w:id="0"/>
     </w:p>
     <w:p>
       <w:pPr>
@@ -5112,6 +5110,8 @@
         <w:jc w:val="both"/>
         <w:rPr>
           <w:rFonts w:ascii="Century Schoolbook" w:hAnsi="Century Schoolbook"/>
+          <w:b/>
+          <w:bCs/>
         </w:rPr>
       </w:pPr>
       <w:r>
@@ -5125,6 +5125,75 @@
     </w:p>
     <w:p>
       <w:pPr>
+        <w:pStyle w:val="ListParagraph"/>
+        <w:numPr>
+          <w:ilvl w:val="0"/>
+          <w:numId w:val="29"/>
+        </w:numPr>
+        <w:jc w:val="both"/>
+        <w:rPr>
+          <w:rFonts w:ascii="Century Schoolbook" w:hAnsi="Century Schoolbook"/>
+        </w:rPr>
+      </w:pPr>
+      <w:r>
+        <w:rPr>
+          <w:rFonts w:ascii="Century Schoolbook" w:hAnsi="Century Schoolbook"/>
+        </w:rPr>
+        <w:t>t</w:t>
+      </w:r>
+      <w:r>
+        <w:rPr>
+          <w:rFonts w:ascii="Century Schoolbook" w:hAnsi="Century Schoolbook"/>
+        </w:rPr>
+        <w:t>-SNE/UMAP show clearer cluster islands; PCA shows more overlap near the center.</w:t>
+      </w:r>
+    </w:p>
+    <w:p>
+      <w:pPr>
+        <w:pStyle w:val="ListParagraph"/>
+        <w:numPr>
+          <w:ilvl w:val="0"/>
+          <w:numId w:val="29"/>
+        </w:numPr>
+        <w:jc w:val="both"/>
+        <w:rPr>
+          <w:rFonts w:ascii="Century Schoolbook" w:hAnsi="Century Schoolbook"/>
+        </w:rPr>
+      </w:pPr>
+      <w:r>
+        <w:rPr>
+          <w:rFonts w:ascii="Century Schoolbook" w:hAnsi="Century Schoolbook"/>
+        </w:rPr>
+        <w:t>PCA struggles because it is linear and cannot capture the non-linear structure of high-dimensional text data as well as t-SNE/UMAP</w:t>
+      </w:r>
+      <w:r>
+        <w:rPr>
+          <w:rFonts w:ascii="Century Schoolbook" w:hAnsi="Century Schoolbook"/>
+        </w:rPr>
+        <w:t>.</w:t>
+      </w:r>
+    </w:p>
+    <w:p>
+      <w:pPr>
+        <w:pStyle w:val="ListParagraph"/>
+        <w:numPr>
+          <w:ilvl w:val="0"/>
+          <w:numId w:val="29"/>
+        </w:numPr>
+        <w:jc w:val="both"/>
+        <w:rPr>
+          <w:rFonts w:ascii="Century Schoolbook" w:hAnsi="Century Schoolbook"/>
+        </w:rPr>
+      </w:pPr>
+      <w:r>
+        <w:rPr>
+          <w:rFonts w:ascii="Century Schoolbook" w:hAnsi="Century Schoolbook"/>
+        </w:rPr>
+        <w:t>In t-SNE, distances between clusters are not always meaningful globally, so large gaps should not be over-interpreted</w:t>
+      </w:r>
+    </w:p>
+    <w:p>
+      <w:pPr>
         <w:jc w:val="both"/>
         <w:rPr>
           <w:rFonts w:ascii="Century Schoolbook" w:hAnsi="Century Schoolbook"/>
@@ -5142,22 +5211,23 @@
         <w:rPr>
           <w:rFonts w:ascii="Century Schoolbook" w:hAnsi="Century Schoolbook"/>
         </w:rPr>
-        <w:t xml:space="preserve"> Yes / No </w:t>
-      </w:r>
-    </w:p>
-    <w:p>
-      <w:pPr>
-        <w:jc w:val="both"/>
-        <w:rPr>
-          <w:rFonts w:ascii="Century Schoolbook" w:hAnsi="Century Schoolbook"/>
-        </w:rPr>
-      </w:pPr>
-      <w:r>
-        <w:rPr>
-          <w:rFonts w:ascii="Century Schoolbook" w:hAnsi="Century Schoolbook"/>
-          <w:b/>
-          <w:bCs/>
-        </w:rPr>
+        <w:t xml:space="preserve"> Yes</w:t>
+      </w:r>
+    </w:p>
+    <w:p>
+      <w:pPr>
+        <w:jc w:val="both"/>
+        <w:rPr>
+          <w:rFonts w:ascii="Century Schoolbook" w:hAnsi="Century Schoolbook"/>
+        </w:rPr>
+      </w:pPr>
+      <w:r>
+        <w:rPr>
+          <w:rFonts w:ascii="Century Schoolbook" w:hAnsi="Century Schoolbook"/>
+          <w:b/>
+          <w:bCs/>
+        </w:rPr>
+        <w:lastRenderedPageBreak/>
         <w:t>If yes, how:</w:t>
       </w:r>
       <w:r>
@@ -5166,6 +5236,18 @@
         </w:rPr>
         <w:t xml:space="preserve"> </w:t>
       </w:r>
+      <w:r>
+        <w:rPr>
+          <w:rFonts w:ascii="Century Schoolbook" w:hAnsi="Century Schoolbook"/>
+        </w:rPr>
+        <w:t xml:space="preserve">To </w:t>
+      </w:r>
+      <w:r>
+        <w:rPr>
+          <w:rFonts w:ascii="Century Schoolbook" w:hAnsi="Century Schoolbook"/>
+        </w:rPr>
+        <w:t>help interpret the PCA, t-SNE, and UMAP scatter plots and to explain the mathematical differences between linear and non-linear dimensionality reduction methods in clear academic language.</w:t>
+      </w:r>
     </w:p>
     <w:p>
       <w:pPr>
@@ -5188,46 +5270,12 @@
         </w:rPr>
         <w:t xml:space="preserve"> </w:t>
       </w:r>
-    </w:p>
-    <w:p>
-      <w:pPr>
-        <w:jc w:val="both"/>
-        <w:rPr>
-          <w:rFonts w:ascii="Century Schoolbook" w:hAnsi="Century Schoolbook"/>
-        </w:rPr>
-      </w:pPr>
-    </w:p>
-    <w:p>
-      <w:pPr>
-        <w:jc w:val="both"/>
-        <w:rPr>
-          <w:rFonts w:ascii="Century Schoolbook" w:hAnsi="Century Schoolbook"/>
-        </w:rPr>
-      </w:pPr>
-    </w:p>
-    <w:p>
-      <w:pPr>
-        <w:jc w:val="both"/>
-        <w:rPr>
-          <w:rFonts w:ascii="Century Schoolbook" w:hAnsi="Century Schoolbook"/>
-        </w:rPr>
-      </w:pPr>
-    </w:p>
-    <w:p>
-      <w:pPr>
-        <w:jc w:val="both"/>
-        <w:rPr>
-          <w:rFonts w:ascii="Century Schoolbook" w:hAnsi="Century Schoolbook"/>
-        </w:rPr>
-      </w:pPr>
-    </w:p>
-    <w:p>
-      <w:pPr>
-        <w:jc w:val="both"/>
-        <w:rPr>
-          <w:rFonts w:ascii="Century Schoolbook" w:hAnsi="Century Schoolbook"/>
-        </w:rPr>
-      </w:pPr>
+      <w:r>
+        <w:rPr>
+          <w:rFonts w:ascii="Century Schoolbook" w:hAnsi="Century Schoolbook"/>
+        </w:rPr>
+        <w:t>https://share.google/aimode/RjTyH75hO8jJAcTLI</w:t>
+      </w:r>
     </w:p>
     <w:p>
       <w:pPr>
@@ -5426,27 +5474,137 @@
     </w:p>
     <w:p>
       <w:pPr>
+        <w:jc w:val="both"/>
+        <w:rPr>
+          <w:rFonts w:ascii="Century Schoolbook" w:hAnsi="Century Schoolbook"/>
+          <w:b/>
+          <w:bCs/>
+        </w:rPr>
+      </w:pPr>
+      <w:r>
+        <w:rPr>
+          <w:rFonts w:ascii="Century Schoolbook" w:hAnsi="Century Schoolbook"/>
+          <w:b/>
+          <w:bCs/>
+        </w:rPr>
+        <w:t>Answer:</w:t>
+      </w:r>
+    </w:p>
+    <w:p>
+      <w:pPr>
         <w:pStyle w:val="ListParagraph"/>
-        <w:jc w:val="both"/>
-        <w:rPr>
-          <w:rFonts w:ascii="Century Schoolbook" w:hAnsi="Century Schoolbook"/>
-        </w:rPr>
-      </w:pPr>
-    </w:p>
-    <w:p>
-      <w:pPr>
-        <w:jc w:val="both"/>
-        <w:rPr>
-          <w:rFonts w:ascii="Century Schoolbook" w:hAnsi="Century Schoolbook"/>
-        </w:rPr>
-      </w:pPr>
-      <w:r>
-        <w:rPr>
-          <w:rFonts w:ascii="Century Schoolbook" w:hAnsi="Century Schoolbook"/>
-          <w:b/>
-          <w:bCs/>
-        </w:rPr>
-        <w:t>Answer:</w:t>
+        <w:numPr>
+          <w:ilvl w:val="0"/>
+          <w:numId w:val="30"/>
+        </w:numPr>
+        <w:jc w:val="both"/>
+        <w:rPr>
+          <w:rFonts w:ascii="Century Schoolbook" w:hAnsi="Century Schoolbook"/>
+        </w:rPr>
+      </w:pPr>
+      <w:r>
+        <w:rPr>
+          <w:rFonts w:ascii="Century Schoolbook" w:hAnsi="Century Schoolbook"/>
+        </w:rPr>
+        <w:t>There are 4 binary columns created, one for each category.</w:t>
+      </w:r>
+    </w:p>
+    <w:p>
+      <w:pPr>
+        <w:pStyle w:val="ListParagraph"/>
+        <w:numPr>
+          <w:ilvl w:val="0"/>
+          <w:numId w:val="30"/>
+        </w:numPr>
+        <w:jc w:val="both"/>
+        <w:rPr>
+          <w:rFonts w:ascii="Century Schoolbook" w:hAnsi="Century Schoolbook"/>
+        </w:rPr>
+      </w:pPr>
+      <w:r>
+        <w:rPr>
+          <w:rFonts w:ascii="Century Schoolbook" w:hAnsi="Century Schoolbook"/>
+        </w:rPr>
+        <w:t>It falsely assumes that the categories have a numerical order and meaningful distance between them.</w:t>
+      </w:r>
+      <w:r>
+        <w:rPr>
+          <w:rFonts w:ascii="Century Schoolbook" w:hAnsi="Century Schoolbook"/>
+        </w:rPr>
+        <w:t xml:space="preserve"> </w:t>
+      </w:r>
+      <w:r>
+        <w:rPr>
+          <w:rFonts w:ascii="Century Schoolbook" w:hAnsi="Century Schoolbook"/>
+        </w:rPr>
+        <w:t>For example, the algo</w:t>
+      </w:r>
+      <w:r>
+        <w:rPr>
+          <w:rFonts w:ascii="Century Schoolbook" w:hAnsi="Century Schoolbook"/>
+        </w:rPr>
+        <w:t xml:space="preserve">rithm may incorrectly interpret, </w:t>
+      </w:r>
+      <w:r>
+        <w:rPr>
+          <w:rFonts w:ascii="Century Schoolbook" w:hAnsi="Century Schoolbook"/>
+        </w:rPr>
+        <w:t>category 3 as being “greater than” category 1</w:t>
+      </w:r>
+      <w:r>
+        <w:rPr>
+          <w:rFonts w:ascii="Century Schoolbook" w:hAnsi="Century Schoolbook"/>
+        </w:rPr>
+        <w:t xml:space="preserve"> and </w:t>
+      </w:r>
+      <w:r>
+        <w:rPr>
+          <w:rFonts w:ascii="Century Schoolbook" w:hAnsi="Century Schoolbook"/>
+        </w:rPr>
+        <w:t>category 2 as being closer to 1 than to 3</w:t>
+      </w:r>
+      <w:r>
+        <w:rPr>
+          <w:rFonts w:ascii="Century Schoolbook" w:hAnsi="Century Schoolbook"/>
+        </w:rPr>
+        <w:t xml:space="preserve">. </w:t>
+      </w:r>
+      <w:r>
+        <w:rPr>
+          <w:rFonts w:ascii="Century Schoolbook" w:hAnsi="Century Schoolbook"/>
+        </w:rPr>
+        <w:t>But these category numbers are only labels, not real numeric values.</w:t>
+      </w:r>
+      <w:r>
+        <w:rPr>
+          <w:rFonts w:ascii="Century Schoolbook" w:hAnsi="Century Schoolbook"/>
+        </w:rPr>
+        <w:t xml:space="preserve"> </w:t>
+      </w:r>
+      <w:r>
+        <w:rPr>
+          <w:rFonts w:ascii="Century Schoolbook" w:hAnsi="Century Schoolbook"/>
+        </w:rPr>
+        <w:t>There is no true mathematical meaning in the difference between 0, 1, 2, and 3.</w:t>
+      </w:r>
+    </w:p>
+    <w:p>
+      <w:pPr>
+        <w:pStyle w:val="ListParagraph"/>
+        <w:numPr>
+          <w:ilvl w:val="0"/>
+          <w:numId w:val="30"/>
+        </w:numPr>
+        <w:jc w:val="both"/>
+        <w:rPr>
+          <w:rFonts w:ascii="Century Schoolbook" w:hAnsi="Century Schoolbook"/>
+        </w:rPr>
+      </w:pPr>
+      <w:r>
+        <w:rPr>
+          <w:rFonts w:ascii="Century Schoolbook" w:hAnsi="Century Schoolbook"/>
+        </w:rPr>
+        <w:t>One-hot binarization represents each category as a separate binary indicator column, so no category is treated as larger, smaller, or closer than another.</w:t>
       </w:r>
     </w:p>
     <w:p>
@@ -5468,7 +5626,7 @@
         <w:rPr>
           <w:rFonts w:ascii="Century Schoolbook" w:hAnsi="Century Schoolbook"/>
         </w:rPr>
-        <w:t xml:space="preserve"> Yes / No </w:t>
+        <w:t xml:space="preserve"> Yes</w:t>
       </w:r>
     </w:p>
     <w:p>
@@ -5492,6 +5650,26 @@
         </w:rPr>
         <w:t xml:space="preserve"> </w:t>
       </w:r>
+      <w:r>
+        <w:rPr>
+          <w:rFonts w:ascii="Century Schoolbook" w:hAnsi="Century Schoolbook"/>
+        </w:rPr>
+        <w:t>T</w:t>
+      </w:r>
+      <w:r>
+        <w:rPr>
+          <w:rFonts w:ascii="Century Schoolbook" w:hAnsi="Century Schoolbook"/>
+        </w:rPr>
+        <w:t>o help explain the difference between integer category encoding and one-hot binarization, and why one-hot encodi</w:t>
+      </w:r>
+      <w:bookmarkStart w:id="0" w:name="_GoBack"/>
+      <w:bookmarkEnd w:id="0"/>
+      <w:r>
+        <w:rPr>
+          <w:rFonts w:ascii="Century Schoolbook" w:hAnsi="Century Schoolbook"/>
+        </w:rPr>
+        <w:t>ng prevents algorithms from making false ordinal assumptions about class labels.</w:t>
+      </w:r>
     </w:p>
     <w:p>
       <w:pPr>
@@ -5513,6 +5691,34 @@
           <w:rFonts w:ascii="Century Schoolbook" w:hAnsi="Century Schoolbook"/>
         </w:rPr>
         <w:t xml:space="preserve"> </w:t>
+      </w:r>
+    </w:p>
+    <w:p>
+      <w:pPr>
+        <w:jc w:val="both"/>
+        <w:rPr>
+          <w:rFonts w:ascii="Century Schoolbook" w:hAnsi="Century Schoolbook"/>
+        </w:rPr>
+      </w:pPr>
+      <w:r>
+        <w:rPr>
+          <w:rFonts w:ascii="Century Schoolbook" w:hAnsi="Century Schoolbook"/>
+        </w:rPr>
+        <w:t>https://share.google/aimode/aH4DxWYHxyVrPtoL9</w:t>
+      </w:r>
+    </w:p>
+    <w:p>
+      <w:pPr>
+        <w:jc w:val="both"/>
+        <w:rPr>
+          <w:rFonts w:ascii="Century Schoolbook" w:hAnsi="Century Schoolbook"/>
+        </w:rPr>
+      </w:pPr>
+      <w:r>
+        <w:rPr>
+          <w:rFonts w:ascii="Century Schoolbook" w:hAnsi="Century Schoolbook"/>
+        </w:rPr>
+        <w:t>https://letsdatascience.com/blog/categorical-encoding-a-practical-guide-to-one-hot-label-and-target-methods</w:t>
       </w:r>
     </w:p>
     <w:p>
@@ -6287,6 +6493,95 @@
     </w:lvl>
   </w:abstractNum>
   <w:abstractNum w:abstractNumId="6" w15:restartNumberingAfterBreak="0">
+    <w:nsid w:val="240915B3"/>
+    <w:multiLevelType w:val="hybridMultilevel"/>
+    <w:tmpl w:val="8B8E3E3C"/>
+    <w:lvl w:ilvl="0" w:tplc="0409000F">
+      <w:start w:val="1"/>
+      <w:numFmt w:val="decimal"/>
+      <w:lvlText w:val="%1."/>
+      <w:lvlJc w:val="left"/>
+      <w:pPr>
+        <w:ind w:left="720" w:hanging="360"/>
+      </w:pPr>
+      <w:rPr>
+        <w:rFonts w:hint="default"/>
+      </w:rPr>
+    </w:lvl>
+    <w:lvl w:ilvl="1" w:tplc="04090019" w:tentative="1">
+      <w:start w:val="1"/>
+      <w:numFmt w:val="lowerLetter"/>
+      <w:lvlText w:val="%2."/>
+      <w:lvlJc w:val="left"/>
+      <w:pPr>
+        <w:ind w:left="1440" w:hanging="360"/>
+      </w:pPr>
+    </w:lvl>
+    <w:lvl w:ilvl="2" w:tplc="0409001B" w:tentative="1">
+      <w:start w:val="1"/>
+      <w:numFmt w:val="lowerRoman"/>
+      <w:lvlText w:val="%3."/>
+      <w:lvlJc w:val="right"/>
+      <w:pPr>
+        <w:ind w:left="2160" w:hanging="180"/>
+      </w:pPr>
+    </w:lvl>
+    <w:lvl w:ilvl="3" w:tplc="0409000F" w:tentative="1">
+      <w:start w:val="1"/>
+      <w:numFmt w:val="decimal"/>
+      <w:lvlText w:val="%4."/>
+      <w:lvlJc w:val="left"/>
+      <w:pPr>
+        <w:ind w:left="2880" w:hanging="360"/>
+      </w:pPr>
+    </w:lvl>
+    <w:lvl w:ilvl="4" w:tplc="04090019" w:tentative="1">
+      <w:start w:val="1"/>
+      <w:numFmt w:val="lowerLetter"/>
+      <w:lvlText w:val="%5."/>
+      <w:lvlJc w:val="left"/>
+      <w:pPr>
+        <w:ind w:left="3600" w:hanging="360"/>
+      </w:pPr>
+    </w:lvl>
+    <w:lvl w:ilvl="5" w:tplc="0409001B" w:tentative="1">
+      <w:start w:val="1"/>
+      <w:numFmt w:val="lowerRoman"/>
+      <w:lvlText w:val="%6."/>
+      <w:lvlJc w:val="right"/>
+      <w:pPr>
+        <w:ind w:left="4320" w:hanging="180"/>
+      </w:pPr>
+    </w:lvl>
+    <w:lvl w:ilvl="6" w:tplc="0409000F" w:tentative="1">
+      <w:start w:val="1"/>
+      <w:numFmt w:val="decimal"/>
+      <w:lvlText w:val="%7."/>
+      <w:lvlJc w:val="left"/>
+      <w:pPr>
+        <w:ind w:left="5040" w:hanging="360"/>
+      </w:pPr>
+    </w:lvl>
+    <w:lvl w:ilvl="7" w:tplc="04090019" w:tentative="1">
+      <w:start w:val="1"/>
+      <w:numFmt w:val="lowerLetter"/>
+      <w:lvlText w:val="%8."/>
+      <w:lvlJc w:val="left"/>
+      <w:pPr>
+        <w:ind w:left="5760" w:hanging="360"/>
+      </w:pPr>
+    </w:lvl>
+    <w:lvl w:ilvl="8" w:tplc="0409001B" w:tentative="1">
+      <w:start w:val="1"/>
+      <w:numFmt w:val="lowerRoman"/>
+      <w:lvlText w:val="%9."/>
+      <w:lvlJc w:val="right"/>
+      <w:pPr>
+        <w:ind w:left="6480" w:hanging="180"/>
+      </w:pPr>
+    </w:lvl>
+  </w:abstractNum>
+  <w:abstractNum w:abstractNumId="7" w15:restartNumberingAfterBreak="0">
     <w:nsid w:val="249C3AB5"/>
     <w:multiLevelType w:val="multilevel"/>
     <w:tmpl w:val="E0B62218"/>
@@ -6399,7 +6694,7 @@
       </w:pPr>
     </w:lvl>
   </w:abstractNum>
-  <w:abstractNum w:abstractNumId="7" w15:restartNumberingAfterBreak="0">
+  <w:abstractNum w:abstractNumId="8" w15:restartNumberingAfterBreak="0">
     <w:nsid w:val="267223F9"/>
     <w:multiLevelType w:val="hybridMultilevel"/>
     <w:tmpl w:val="7B84E6F4"/>
@@ -6485,7 +6780,7 @@
       </w:pPr>
     </w:lvl>
   </w:abstractNum>
-  <w:abstractNum w:abstractNumId="8" w15:restartNumberingAfterBreak="0">
+  <w:abstractNum w:abstractNumId="9" w15:restartNumberingAfterBreak="0">
     <w:nsid w:val="2E302043"/>
     <w:multiLevelType w:val="multilevel"/>
     <w:tmpl w:val="9E884AC6"/>
@@ -6634,7 +6929,7 @@
       </w:rPr>
     </w:lvl>
   </w:abstractNum>
-  <w:abstractNum w:abstractNumId="9" w15:restartNumberingAfterBreak="0">
+  <w:abstractNum w:abstractNumId="10" w15:restartNumberingAfterBreak="0">
     <w:nsid w:val="2ECF777E"/>
     <w:multiLevelType w:val="multilevel"/>
     <w:tmpl w:val="CB4808A0"/>
@@ -6747,7 +7042,7 @@
       </w:pPr>
     </w:lvl>
   </w:abstractNum>
-  <w:abstractNum w:abstractNumId="10" w15:restartNumberingAfterBreak="0">
+  <w:abstractNum w:abstractNumId="11" w15:restartNumberingAfterBreak="0">
     <w:nsid w:val="31B12222"/>
     <w:multiLevelType w:val="hybridMultilevel"/>
     <w:tmpl w:val="957ACC4C"/>
@@ -6836,7 +7131,7 @@
       </w:pPr>
     </w:lvl>
   </w:abstractNum>
-  <w:abstractNum w:abstractNumId="11" w15:restartNumberingAfterBreak="0">
+  <w:abstractNum w:abstractNumId="12" w15:restartNumberingAfterBreak="0">
     <w:nsid w:val="4A892D1C"/>
     <w:multiLevelType w:val="hybridMultilevel"/>
     <w:tmpl w:val="6A081320"/>
@@ -6970,7 +7265,96 @@
       </w:rPr>
     </w:lvl>
   </w:abstractNum>
-  <w:abstractNum w:abstractNumId="12" w15:restartNumberingAfterBreak="0">
+  <w:abstractNum w:abstractNumId="13" w15:restartNumberingAfterBreak="0">
+    <w:nsid w:val="4DA32339"/>
+    <w:multiLevelType w:val="hybridMultilevel"/>
+    <w:tmpl w:val="E522DFE8"/>
+    <w:lvl w:ilvl="0" w:tplc="0409000F">
+      <w:start w:val="1"/>
+      <w:numFmt w:val="decimal"/>
+      <w:lvlText w:val="%1."/>
+      <w:lvlJc w:val="left"/>
+      <w:pPr>
+        <w:ind w:left="720" w:hanging="360"/>
+      </w:pPr>
+      <w:rPr>
+        <w:rFonts w:hint="default"/>
+      </w:rPr>
+    </w:lvl>
+    <w:lvl w:ilvl="1" w:tplc="04090019" w:tentative="1">
+      <w:start w:val="1"/>
+      <w:numFmt w:val="lowerLetter"/>
+      <w:lvlText w:val="%2."/>
+      <w:lvlJc w:val="left"/>
+      <w:pPr>
+        <w:ind w:left="1440" w:hanging="360"/>
+      </w:pPr>
+    </w:lvl>
+    <w:lvl w:ilvl="2" w:tplc="0409001B" w:tentative="1">
+      <w:start w:val="1"/>
+      <w:numFmt w:val="lowerRoman"/>
+      <w:lvlText w:val="%3."/>
+      <w:lvlJc w:val="right"/>
+      <w:pPr>
+        <w:ind w:left="2160" w:hanging="180"/>
+      </w:pPr>
+    </w:lvl>
+    <w:lvl w:ilvl="3" w:tplc="0409000F" w:tentative="1">
+      <w:start w:val="1"/>
+      <w:numFmt w:val="decimal"/>
+      <w:lvlText w:val="%4."/>
+      <w:lvlJc w:val="left"/>
+      <w:pPr>
+        <w:ind w:left="2880" w:hanging="360"/>
+      </w:pPr>
+    </w:lvl>
+    <w:lvl w:ilvl="4" w:tplc="04090019" w:tentative="1">
+      <w:start w:val="1"/>
+      <w:numFmt w:val="lowerLetter"/>
+      <w:lvlText w:val="%5."/>
+      <w:lvlJc w:val="left"/>
+      <w:pPr>
+        <w:ind w:left="3600" w:hanging="360"/>
+      </w:pPr>
+    </w:lvl>
+    <w:lvl w:ilvl="5" w:tplc="0409001B" w:tentative="1">
+      <w:start w:val="1"/>
+      <w:numFmt w:val="lowerRoman"/>
+      <w:lvlText w:val="%6."/>
+      <w:lvlJc w:val="right"/>
+      <w:pPr>
+        <w:ind w:left="4320" w:hanging="180"/>
+      </w:pPr>
+    </w:lvl>
+    <w:lvl w:ilvl="6" w:tplc="0409000F" w:tentative="1">
+      <w:start w:val="1"/>
+      <w:numFmt w:val="decimal"/>
+      <w:lvlText w:val="%7."/>
+      <w:lvlJc w:val="left"/>
+      <w:pPr>
+        <w:ind w:left="5040" w:hanging="360"/>
+      </w:pPr>
+    </w:lvl>
+    <w:lvl w:ilvl="7" w:tplc="04090019" w:tentative="1">
+      <w:start w:val="1"/>
+      <w:numFmt w:val="lowerLetter"/>
+      <w:lvlText w:val="%8."/>
+      <w:lvlJc w:val="left"/>
+      <w:pPr>
+        <w:ind w:left="5760" w:hanging="360"/>
+      </w:pPr>
+    </w:lvl>
+    <w:lvl w:ilvl="8" w:tplc="0409001B" w:tentative="1">
+      <w:start w:val="1"/>
+      <w:numFmt w:val="lowerRoman"/>
+      <w:lvlText w:val="%9."/>
+      <w:lvlJc w:val="right"/>
+      <w:pPr>
+        <w:ind w:left="6480" w:hanging="180"/>
+      </w:pPr>
+    </w:lvl>
+  </w:abstractNum>
+  <w:abstractNum w:abstractNumId="14" w15:restartNumberingAfterBreak="0">
     <w:nsid w:val="4DD357A6"/>
     <w:multiLevelType w:val="multilevel"/>
     <w:tmpl w:val="707E0AF4"/>
@@ -7083,7 +7467,7 @@
       </w:pPr>
     </w:lvl>
   </w:abstractNum>
-  <w:abstractNum w:abstractNumId="13" w15:restartNumberingAfterBreak="0">
+  <w:abstractNum w:abstractNumId="15" w15:restartNumberingAfterBreak="0">
     <w:nsid w:val="4FA53F13"/>
     <w:multiLevelType w:val="multilevel"/>
     <w:tmpl w:val="143EEEE0"/>
@@ -7196,7 +7580,7 @@
       </w:pPr>
     </w:lvl>
   </w:abstractNum>
-  <w:abstractNum w:abstractNumId="14" w15:restartNumberingAfterBreak="0">
+  <w:abstractNum w:abstractNumId="16" w15:restartNumberingAfterBreak="0">
     <w:nsid w:val="4FEE2DCD"/>
     <w:multiLevelType w:val="hybridMultilevel"/>
     <w:tmpl w:val="7C02C068"/>
@@ -7286,7 +7670,7 @@
       </w:pPr>
     </w:lvl>
   </w:abstractNum>
-  <w:abstractNum w:abstractNumId="15" w15:restartNumberingAfterBreak="0">
+  <w:abstractNum w:abstractNumId="17" w15:restartNumberingAfterBreak="0">
     <w:nsid w:val="50686C5F"/>
     <w:multiLevelType w:val="multilevel"/>
     <w:tmpl w:val="9F2C0B54"/>
@@ -7399,7 +7783,7 @@
       </w:pPr>
     </w:lvl>
   </w:abstractNum>
-  <w:abstractNum w:abstractNumId="16" w15:restartNumberingAfterBreak="0">
+  <w:abstractNum w:abstractNumId="18" w15:restartNumberingAfterBreak="0">
     <w:nsid w:val="510B6AF3"/>
     <w:multiLevelType w:val="hybridMultilevel"/>
     <w:tmpl w:val="6B0E57B6"/>
@@ -7539,7 +7923,7 @@
       </w:rPr>
     </w:lvl>
   </w:abstractNum>
-  <w:abstractNum w:abstractNumId="17" w15:restartNumberingAfterBreak="0">
+  <w:abstractNum w:abstractNumId="19" w15:restartNumberingAfterBreak="0">
     <w:nsid w:val="576A4380"/>
     <w:multiLevelType w:val="hybridMultilevel"/>
     <w:tmpl w:val="7F86CB26"/>
@@ -7625,7 +8009,7 @@
       </w:pPr>
     </w:lvl>
   </w:abstractNum>
-  <w:abstractNum w:abstractNumId="18" w15:restartNumberingAfterBreak="0">
+  <w:abstractNum w:abstractNumId="20" w15:restartNumberingAfterBreak="0">
     <w:nsid w:val="600745AA"/>
     <w:multiLevelType w:val="hybridMultilevel"/>
     <w:tmpl w:val="7BCE176C"/>
@@ -7765,7 +8149,7 @@
       </w:rPr>
     </w:lvl>
   </w:abstractNum>
-  <w:abstractNum w:abstractNumId="19" w15:restartNumberingAfterBreak="0">
+  <w:abstractNum w:abstractNumId="21" w15:restartNumberingAfterBreak="0">
     <w:nsid w:val="63660093"/>
     <w:multiLevelType w:val="multilevel"/>
     <w:tmpl w:val="487AC5E8"/>
@@ -7878,7 +8262,7 @@
       </w:pPr>
     </w:lvl>
   </w:abstractNum>
-  <w:abstractNum w:abstractNumId="20" w15:restartNumberingAfterBreak="0">
+  <w:abstractNum w:abstractNumId="22" w15:restartNumberingAfterBreak="0">
     <w:nsid w:val="66633041"/>
     <w:multiLevelType w:val="hybridMultilevel"/>
     <w:tmpl w:val="F3BAEAD8"/>
@@ -8018,7 +8402,7 @@
       </w:rPr>
     </w:lvl>
   </w:abstractNum>
-  <w:abstractNum w:abstractNumId="21" w15:restartNumberingAfterBreak="0">
+  <w:abstractNum w:abstractNumId="23" w15:restartNumberingAfterBreak="0">
     <w:nsid w:val="672424BE"/>
     <w:multiLevelType w:val="hybridMultilevel"/>
     <w:tmpl w:val="25545D90"/>
@@ -8107,7 +8491,7 @@
       </w:pPr>
     </w:lvl>
   </w:abstractNum>
-  <w:abstractNum w:abstractNumId="22" w15:restartNumberingAfterBreak="0">
+  <w:abstractNum w:abstractNumId="24" w15:restartNumberingAfterBreak="0">
     <w:nsid w:val="67445AD2"/>
     <w:multiLevelType w:val="hybridMultilevel"/>
     <w:tmpl w:val="C4DE3054"/>
@@ -8247,7 +8631,7 @@
       </w:rPr>
     </w:lvl>
   </w:abstractNum>
-  <w:abstractNum w:abstractNumId="23" w15:restartNumberingAfterBreak="0">
+  <w:abstractNum w:abstractNumId="25" w15:restartNumberingAfterBreak="0">
     <w:nsid w:val="6E5869E4"/>
     <w:multiLevelType w:val="multilevel"/>
     <w:tmpl w:val="22AC937C"/>
@@ -8360,7 +8744,7 @@
       </w:pPr>
     </w:lvl>
   </w:abstractNum>
-  <w:abstractNum w:abstractNumId="24" w15:restartNumberingAfterBreak="0">
+  <w:abstractNum w:abstractNumId="26" w15:restartNumberingAfterBreak="0">
     <w:nsid w:val="6F90345B"/>
     <w:multiLevelType w:val="multilevel"/>
     <w:tmpl w:val="76CCD152"/>
@@ -8473,7 +8857,7 @@
       </w:pPr>
     </w:lvl>
   </w:abstractNum>
-  <w:abstractNum w:abstractNumId="25" w15:restartNumberingAfterBreak="0">
+  <w:abstractNum w:abstractNumId="27" w15:restartNumberingAfterBreak="0">
     <w:nsid w:val="745C3AEA"/>
     <w:multiLevelType w:val="hybridMultilevel"/>
     <w:tmpl w:val="AB2AF8BA"/>
@@ -8586,7 +8970,7 @@
       </w:rPr>
     </w:lvl>
   </w:abstractNum>
-  <w:abstractNum w:abstractNumId="26" w15:restartNumberingAfterBreak="0">
+  <w:abstractNum w:abstractNumId="28" w15:restartNumberingAfterBreak="0">
     <w:nsid w:val="755D4AD5"/>
     <w:multiLevelType w:val="multilevel"/>
     <w:tmpl w:val="1AF6A79A"/>
@@ -8735,7 +9119,7 @@
       </w:rPr>
     </w:lvl>
   </w:abstractNum>
-  <w:abstractNum w:abstractNumId="27" w15:restartNumberingAfterBreak="0">
+  <w:abstractNum w:abstractNumId="29" w15:restartNumberingAfterBreak="0">
     <w:nsid w:val="7D601873"/>
     <w:multiLevelType w:val="multilevel"/>
     <w:tmpl w:val="6660EE9E"/>
@@ -8885,64 +9269,64 @@
     </w:lvl>
   </w:abstractNum>
   <w:num w:numId="1">
-    <w:abstractNumId w:val="8"/>
+    <w:abstractNumId w:val="9"/>
   </w:num>
   <w:num w:numId="2">
-    <w:abstractNumId w:val="15"/>
+    <w:abstractNumId w:val="17"/>
   </w:num>
   <w:num w:numId="3">
     <w:abstractNumId w:val="0"/>
   </w:num>
   <w:num w:numId="4">
-    <w:abstractNumId w:val="26"/>
+    <w:abstractNumId w:val="28"/>
   </w:num>
   <w:num w:numId="5">
     <w:abstractNumId w:val="2"/>
   </w:num>
   <w:num w:numId="6">
-    <w:abstractNumId w:val="6"/>
+    <w:abstractNumId w:val="7"/>
   </w:num>
   <w:num w:numId="7">
-    <w:abstractNumId w:val="24"/>
+    <w:abstractNumId w:val="26"/>
   </w:num>
   <w:num w:numId="8">
-    <w:abstractNumId w:val="9"/>
+    <w:abstractNumId w:val="10"/>
   </w:num>
   <w:num w:numId="9">
-    <w:abstractNumId w:val="23"/>
+    <w:abstractNumId w:val="25"/>
   </w:num>
   <w:num w:numId="10">
-    <w:abstractNumId w:val="19"/>
+    <w:abstractNumId w:val="21"/>
   </w:num>
   <w:num w:numId="11">
-    <w:abstractNumId w:val="12"/>
+    <w:abstractNumId w:val="14"/>
   </w:num>
   <w:num w:numId="12">
-    <w:abstractNumId w:val="13"/>
+    <w:abstractNumId w:val="15"/>
   </w:num>
   <w:num w:numId="13">
-    <w:abstractNumId w:val="27"/>
+    <w:abstractNumId w:val="29"/>
   </w:num>
   <w:num w:numId="14">
-    <w:abstractNumId w:val="25"/>
+    <w:abstractNumId w:val="27"/>
   </w:num>
   <w:num w:numId="15">
     <w:abstractNumId w:val="3"/>
   </w:num>
   <w:num w:numId="16">
-    <w:abstractNumId w:val="16"/>
+    <w:abstractNumId w:val="18"/>
   </w:num>
   <w:num w:numId="17">
-    <w:abstractNumId w:val="18"/>
+    <w:abstractNumId w:val="20"/>
   </w:num>
   <w:num w:numId="18">
-    <w:abstractNumId w:val="22"/>
+    <w:abstractNumId w:val="24"/>
   </w:num>
   <w:num w:numId="19">
-    <w:abstractNumId w:val="11"/>
+    <w:abstractNumId w:val="12"/>
   </w:num>
   <w:num w:numId="20">
-    <w:abstractNumId w:val="17"/>
+    <w:abstractNumId w:val="19"/>
   </w:num>
   <w:num w:numId="21">
     <w:abstractNumId w:val="5"/>
@@ -8951,22 +9335,28 @@
     <w:abstractNumId w:val="1"/>
   </w:num>
   <w:num w:numId="23">
-    <w:abstractNumId w:val="7"/>
+    <w:abstractNumId w:val="8"/>
   </w:num>
   <w:num w:numId="24">
-    <w:abstractNumId w:val="20"/>
+    <w:abstractNumId w:val="22"/>
   </w:num>
   <w:num w:numId="25">
-    <w:abstractNumId w:val="14"/>
+    <w:abstractNumId w:val="16"/>
   </w:num>
   <w:num w:numId="26">
-    <w:abstractNumId w:val="21"/>
+    <w:abstractNumId w:val="23"/>
   </w:num>
   <w:num w:numId="27">
-    <w:abstractNumId w:val="10"/>
+    <w:abstractNumId w:val="11"/>
   </w:num>
   <w:num w:numId="28">
     <w:abstractNumId w:val="4"/>
+  </w:num>
+  <w:num w:numId="29">
+    <w:abstractNumId w:val="6"/>
+  </w:num>
+  <w:num w:numId="30">
+    <w:abstractNumId w:val="13"/>
   </w:num>
 </w:numbering>
 </file>

</xml_diff>